<commit_message>
frontend UI update and added image
</commit_message>
<xml_diff>
--- a/frontend/public/HAZOP_Master_Prompt_Library_v3.docx
+++ b/frontend/public/HAZOP_Master_Prompt_Library_v3.docx
@@ -7,16 +7,86 @@
         <w:shd w:val="clear" w:color="auto" w:fill="1F3864"/>
         <w:spacing w:before="1440"/>
         <w:jc w:val="center"/>
+        <w:rPr>
+          <w:b w:val="1"/>
+          <w:bCs w:val="1"/>
+          <w:color w:val="FFFFFF" w:themeColor="background1" w:themeTint="FF" w:themeShade="FF"/>
+          <w:sz w:val="60"/>
+          <w:szCs w:val="60"/>
+        </w:rPr>
       </w:pPr>
       <w:r>
         <w:rPr>
-          <w:b/>
-          <w:bCs/>
-          <w:color w:val="FFFFFF"/>
+          <w:b w:val="1"/>
+          <w:bCs w:val="1"/>
+          <w:color w:val="FFFFFF" w:themeColor="background1" w:themeTint="FF" w:themeShade="FF"/>
           <w:sz w:val="60"/>
           <w:szCs w:val="60"/>
         </w:rPr>
-        <w:t xml:space="preserve">  HAZOP MASTER PROMPT LIBRARY  </w:t>
+        <w:t xml:space="preserve">  </w:t>
+      </w:r>
+      <w:r>
+        <w:rPr>
+          <w:b w:val="1"/>
+          <w:bCs w:val="1"/>
+          <w:color w:val="FFFFFF" w:themeColor="background1" w:themeTint="FF" w:themeShade="FF"/>
+          <w:sz w:val="60"/>
+          <w:szCs w:val="60"/>
+        </w:rPr>
+        <w:t xml:space="preserve">OXY- GOA </w:t>
+      </w:r>
+      <w:r>
+        <w:rPr>
+          <w:b w:val="1"/>
+          <w:bCs w:val="1"/>
+          <w:color w:val="FFFFFF" w:themeColor="background1" w:themeTint="FF" w:themeShade="FF"/>
+          <w:sz w:val="60"/>
+          <w:szCs w:val="60"/>
+        </w:rPr>
+        <w:t>HAZOP</w:t>
+      </w:r>
+      <w:r>
+        <w:rPr>
+          <w:b w:val="1"/>
+          <w:bCs w:val="1"/>
+          <w:color w:val="FFFFFF" w:themeColor="background1" w:themeTint="FF" w:themeShade="FF"/>
+          <w:sz w:val="60"/>
+          <w:szCs w:val="60"/>
+        </w:rPr>
+        <w:t>GURU</w:t>
+      </w:r>
+      <w:r>
+        <w:rPr>
+          <w:b w:val="1"/>
+          <w:bCs w:val="1"/>
+          <w:color w:val="FFFFFF" w:themeColor="background1" w:themeTint="FF" w:themeShade="FF"/>
+          <w:sz w:val="60"/>
+          <w:szCs w:val="60"/>
+        </w:rPr>
+        <w:t xml:space="preserve"> </w:t>
+      </w:r>
+      <w:r>
+        <w:br/>
+      </w:r>
+      <w:r>
+        <w:rPr>
+          <w:b w:val="1"/>
+          <w:bCs w:val="1"/>
+          <w:color w:val="FFFFFF" w:themeColor="background1" w:themeTint="FF" w:themeShade="FF"/>
+          <w:sz w:val="60"/>
+          <w:szCs w:val="60"/>
+        </w:rPr>
+        <w:t>M</w:t>
+      </w:r>
+      <w:r>
+        <w:rPr>
+          <w:b w:val="1"/>
+          <w:bCs w:val="1"/>
+          <w:color w:val="FFFFFF" w:themeColor="background1" w:themeTint="FF" w:themeShade="FF"/>
+          <w:sz w:val="60"/>
+          <w:szCs w:val="60"/>
+        </w:rPr>
+        <w:t xml:space="preserve">ASTER PROMPT LIBRARY  </w:t>
       </w:r>
     </w:p>
     <w:p>
@@ -1134,7 +1204,7 @@
       </w:pPr>
       <w:r>
         <w:drawing>
-          <wp:inline wp14:editId="508EC149" wp14:anchorId="0702DFBF">
+          <wp:inline wp14:editId="77B666E0" wp14:anchorId="0702DFBF">
             <wp:extent cx="4777740" cy="3330575"/>
             <wp:effectExtent l="0" t="0" r="3810" b="3175"/>
             <wp:docPr id="1390286700" name="Picture 9"/>
@@ -1182,15 +1252,24 @@
           </wp:inline>
         </w:drawing>
       </w:r>
+    </w:p>
+    <w:p>
+      <w:pPr>
+        <w:pStyle w:val="Normal"/>
+      </w:pPr>
       <w:r>
         <w:br w:type="page"/>
       </w:r>
       <w:r>
+        <w:rPr/>
+        <w:t>Table 5- Consequence Comments</w:t>
+      </w:r>
+      <w:r>
         <w:drawing>
-          <wp:inline wp14:editId="0810D7FB" wp14:anchorId="10AE62EC">
-            <wp:extent cx="5943600" cy="1356360"/>
+          <wp:inline wp14:editId="30AD9F4D" wp14:anchorId="06DF5F20">
+            <wp:extent cx="6400800" cy="1466850"/>
             <wp:effectExtent l="0" t="0" r="0" b="0"/>
-            <wp:docPr id="451973465" name="Picture 8"/>
+            <wp:docPr id="314463891" name="drawing"/>
             <wp:cNvGraphicFramePr>
               <a:graphicFrameLocks noChangeAspect="1"/>
             </wp:cNvGraphicFramePr>
@@ -1198,36 +1277,29 @@
               <a:graphicData xmlns:a="http://schemas.openxmlformats.org/drawingml/2006/main" uri="http://schemas.openxmlformats.org/drawingml/2006/picture">
                 <pic:pic xmlns:pic="http://schemas.openxmlformats.org/drawingml/2006/picture">
                   <pic:nvPicPr>
-                    <pic:cNvPr id="0" name="Picture 8"/>
-                    <pic:cNvPicPr>
-                      <a:picLocks noChangeAspect="1" noChangeArrowheads="1"/>
-                    </pic:cNvPicPr>
+                    <pic:cNvPr id="314463891" name="Picture 314463891"/>
+                    <pic:cNvPicPr/>
                   </pic:nvPicPr>
                   <pic:blipFill>
-                    <a:blip xmlns:r="http://schemas.openxmlformats.org/officeDocument/2006/relationships" r:embed="rId8">
+                    <a:blip xmlns:r="http://schemas.openxmlformats.org/officeDocument/2006/relationships" r:embed="rId1339071027">
                       <a:extLst>
                         <a:ext uri="{28A0092B-C50C-407E-A947-70E740481C1C}">
-                          <a14:useLocalDpi xmlns:a14="http://schemas.microsoft.com/office/drawing/2010/main" val="0"/>
+                          <a14:useLocalDpi xmlns:a14="http://schemas.microsoft.com/office/drawing/2010/main"/>
                         </a:ext>
                       </a:extLst>
                     </a:blip>
-                    <a:srcRect/>
                     <a:stretch>
                       <a:fillRect/>
                     </a:stretch>
                   </pic:blipFill>
-                  <pic:spPr bwMode="auto">
+                  <pic:spPr>
                     <a:xfrm>
                       <a:off x="0" y="0"/>
-                      <a:ext cx="5943600" cy="1356360"/>
+                      <a:ext cx="6400800" cy="1466850"/>
                     </a:xfrm>
                     <a:prstGeom prst="rect">
                       <a:avLst/>
                     </a:prstGeom>
-                    <a:noFill/>
-                    <a:ln>
-                      <a:noFill/>
-                    </a:ln>
                   </pic:spPr>
                 </pic:pic>
               </a:graphicData>
@@ -1235,9 +1307,26 @@
           </wp:inline>
         </w:drawing>
       </w:r>
+    </w:p>
+    <w:p>
+      <w:pPr>
+        <w:pStyle w:val="Normal"/>
+        <w:spacing w:before="1200"/>
+      </w:pPr>
+      <w:r>
+        <w:rPr/>
+        <w:t>Table 4-</w:t>
+      </w:r>
+      <w:r>
+        <w:rPr/>
+        <w:t>PAF Consequence Category-Production Deck</w:t>
+      </w:r>
+      <w:r>
+        <w:br/>
+      </w:r>
       <w:r>
         <w:drawing>
-          <wp:inline wp14:editId="46B6C7E8" wp14:anchorId="0D15A49F">
+          <wp:inline wp14:editId="339CC0A4" wp14:anchorId="0D15A49F">
             <wp:extent cx="4564380" cy="1866900"/>
             <wp:effectExtent l="0" t="0" r="7620" b="0"/>
             <wp:docPr id="200551887" name="Picture 7"/>
@@ -1286,8 +1375,24 @@
         </w:drawing>
       </w:r>
       <w:r>
+        <w:br/>
+      </w:r>
+      <w:r>
+        <w:br/>
+      </w:r>
+      <w:r>
+        <w:br/>
+      </w:r>
+      <w:r>
+        <w:rPr/>
+        <w:t>LOPC EVENT TREE OF GAS-</w:t>
+      </w:r>
+      <w:r>
+        <w:br/>
+      </w:r>
+      <w:r>
         <w:drawing>
-          <wp:inline wp14:editId="49E0BEBA" wp14:anchorId="125913AC">
+          <wp:inline wp14:editId="544A5441" wp14:anchorId="125913AC">
             <wp:extent cx="4610100" cy="2247900"/>
             <wp:effectExtent l="0" t="0" r="0" b="0"/>
             <wp:docPr id="1354578378" name="Picture 6"/>
@@ -1336,10 +1441,55 @@
         </w:drawing>
       </w:r>
       <w:r>
+        <w:br/>
+      </w:r>
+      <w:r>
+        <w:br/>
+      </w:r>
+      <w:r>
+        <w:rPr/>
+        <w:t xml:space="preserve"> </w:t>
+      </w:r>
+    </w:p>
+    <w:p>
+      <w:pPr>
+        <w:pStyle w:val="Normal"/>
+        <w:spacing w:before="1200"/>
+      </w:pPr>
+    </w:p>
+    <w:p>
+      <w:pPr>
+        <w:pStyle w:val="Normal"/>
+      </w:pPr>
+    </w:p>
+    <w:p>
+      <w:pPr>
+        <w:pStyle w:val="Normal"/>
+      </w:pPr>
+    </w:p>
+    <w:p>
+      <w:pPr>
+        <w:pStyle w:val="Normal"/>
+      </w:pPr>
+    </w:p>
+    <w:p>
+      <w:pPr>
+        <w:pStyle w:val="Normal"/>
+      </w:pPr>
+      <w:r>
+        <w:rPr/>
+        <w:t>LOPC EVENT TREE OF Liquid-</w:t>
+      </w:r>
+    </w:p>
+    <w:p>
+      <w:pPr>
+        <w:pStyle w:val="Normal"/>
+      </w:pPr>
+      <w:r>
         <w:drawing>
-          <wp:inline wp14:editId="064F8DFC" wp14:anchorId="7E5471E4">
-            <wp:extent cx="4381500" cy="2202180"/>
-            <wp:effectExtent l="0" t="0" r="0" b="7620"/>
+          <wp:inline wp14:editId="4D2ECBA5" wp14:anchorId="7E5471E4">
+            <wp:extent cx="3915156" cy="1967791"/>
+            <wp:effectExtent l="0" t="0" r="0" b="0"/>
             <wp:docPr id="660123957" name="Picture 5"/>
             <wp:cNvGraphicFramePr>
               <a:graphicFrameLocks noChangeAspect="1"/>
@@ -1357,7 +1507,7 @@
                     <a:blip xmlns:r="http://schemas.openxmlformats.org/officeDocument/2006/relationships" r:embed="rId11">
                       <a:extLst>
                         <a:ext uri="{28A0092B-C50C-407E-A947-70E740481C1C}">
-                          <a14:useLocalDpi xmlns:a14="http://schemas.microsoft.com/office/drawing/2010/main" val="0"/>
+                          <a14:useLocalDpi xmlns:a14="http://schemas.microsoft.com/office/drawing/2010/main"/>
                         </a:ext>
                       </a:extLst>
                     </a:blip>
@@ -1367,9 +1517,9 @@
                     </a:stretch>
                   </pic:blipFill>
                   <pic:spPr bwMode="auto">
-                    <a:xfrm>
+                    <a:xfrm rot="0">
                       <a:off x="0" y="0"/>
-                      <a:ext cx="4381500" cy="2202180"/>
+                      <a:ext cx="3915156" cy="1967791"/>
                     </a:xfrm>
                     <a:prstGeom prst="rect">
                       <a:avLst/>
@@ -1386,8 +1536,17 @@
         </w:drawing>
       </w:r>
       <w:r>
+        <w:br/>
+      </w:r>
+      <w:r>
+        <w:br/>
+      </w:r>
+      <w:r>
+        <w:br/>
+      </w:r>
+      <w:r>
         <w:drawing>
-          <wp:inline wp14:editId="39F05055" wp14:anchorId="08A231D1">
+          <wp:inline wp14:editId="52786065" wp14:anchorId="08A231D1">
             <wp:extent cx="3718560" cy="2331720"/>
             <wp:effectExtent l="0" t="0" r="0" b="0"/>
             <wp:docPr id="270255822" name="Picture 4"/>
@@ -1437,7 +1596,7 @@
       </w:r>
       <w:r>
         <w:drawing>
-          <wp:inline wp14:editId="6E2DC869" wp14:anchorId="515DC750">
+          <wp:inline wp14:editId="0BB38308" wp14:anchorId="515DC750">
             <wp:extent cx="6400800" cy="4761230"/>
             <wp:effectExtent l="0" t="0" r="0" b="1270"/>
             <wp:docPr id="84836013" name="Picture 3"/>
@@ -1486,8 +1645,18 @@
         </w:drawing>
       </w:r>
       <w:r>
+        <w:br/>
+      </w:r>
+      <w:r>
+        <w:rPr/>
+        <w:t>Risk Matrix-</w:t>
+      </w:r>
+      <w:r>
+        <w:br/>
+      </w:r>
+      <w:r>
         <w:drawing>
-          <wp:inline wp14:editId="44008261" wp14:anchorId="39F892ED">
+          <wp:inline wp14:editId="2BBD1100" wp14:anchorId="39F892ED">
             <wp:extent cx="4899660" cy="2689860"/>
             <wp:effectExtent l="0" t="0" r="0" b="0"/>
             <wp:docPr id="469943873" name="Picture 1"/>
@@ -1534,6 +1703,18 @@
             </a:graphic>
           </wp:inline>
         </w:drawing>
+      </w:r>
+      <w:r>
+        <w:br/>
+      </w:r>
+      <w:r>
+        <w:br/>
+      </w:r>
+      <w:r>
+        <w:br/>
+      </w:r>
+      <w:r>
+        <w:br/>
       </w:r>
     </w:p>
     <w:p>
@@ -1847,9 +2028,9 @@
         <w:tblLook w:val="04A0" w:firstRow="1" w:lastRow="0" w:firstColumn="1" w:lastColumn="0" w:noHBand="0" w:noVBand="1"/>
       </w:tblPr>
       <w:tblGrid>
-        <w:gridCol w:w="470"/>
-        <w:gridCol w:w="2369"/>
-        <w:gridCol w:w="2362"/>
+        <w:gridCol w:w="546"/>
+        <w:gridCol w:w="2407"/>
+        <w:gridCol w:w="2248"/>
         <w:gridCol w:w="743"/>
         <w:gridCol w:w="1291"/>
         <w:gridCol w:w="2125"/>
@@ -1866,7 +2047,7 @@
         </w:trPr>
         <w:tc>
           <w:tcPr>
-            <w:tcW w:w="0" w:type="auto"/>
+            <w:tcW w:w="546" w:type="dxa"/>
             <w:tcBorders>
               <w:top w:val="single" w:color="BBBBBB" w:sz="6" w:space="0"/>
               <w:left w:val="single" w:color="BBBBBB" w:sz="6" w:space="0"/>
@@ -1897,7 +2078,7 @@
         </w:tc>
         <w:tc>
           <w:tcPr>
-            <w:tcW w:w="0" w:type="auto"/>
+            <w:tcW w:w="2407" w:type="dxa"/>
             <w:tcBorders>
               <w:top w:val="single" w:color="BBBBBB" w:sz="6" w:space="0"/>
               <w:left w:val="single" w:color="BBBBBB" w:sz="6" w:space="0"/>
@@ -1928,7 +2109,7 @@
         </w:tc>
         <w:tc>
           <w:tcPr>
-            <w:tcW w:w="0" w:type="auto"/>
+            <w:tcW w:w="2248" w:type="dxa"/>
             <w:tcBorders>
               <w:top w:val="single" w:color="BBBBBB" w:sz="6" w:space="0"/>
               <w:left w:val="single" w:color="BBBBBB" w:sz="6" w:space="0"/>
@@ -1959,7 +2140,7 @@
         </w:tc>
         <w:tc>
           <w:tcPr>
-            <w:tcW w:w="0" w:type="auto"/>
+            <w:tcW w:w="743" w:type="dxa"/>
             <w:tcBorders>
               <w:top w:val="single" w:color="BBBBBB" w:sz="6" w:space="0"/>
               <w:left w:val="single" w:color="BBBBBB" w:sz="6" w:space="0"/>
@@ -1990,7 +2171,7 @@
         </w:tc>
         <w:tc>
           <w:tcPr>
-            <w:tcW w:w="0" w:type="auto"/>
+            <w:tcW w:w="1291" w:type="dxa"/>
             <w:tcBorders>
               <w:top w:val="single" w:color="BBBBBB" w:sz="6" w:space="0"/>
               <w:left w:val="single" w:color="BBBBBB" w:sz="6" w:space="0"/>
@@ -2021,7 +2202,7 @@
         </w:tc>
         <w:tc>
           <w:tcPr>
-            <w:tcW w:w="0" w:type="auto"/>
+            <w:tcW w:w="2125" w:type="dxa"/>
             <w:tcBorders>
               <w:top w:val="single" w:color="BBBBBB" w:sz="6" w:space="0"/>
               <w:left w:val="single" w:color="BBBBBB" w:sz="6" w:space="0"/>
@@ -2060,14 +2241,14 @@
         </w:tblPrEx>
         <w:tc>
           <w:tcPr>
-            <w:tcW w:w="0" w:type="auto"/>
-            <w:tcBorders>
-              <w:top w:val="single" w:color="BBBBBB" w:sz="6" w:space="0"/>
-              <w:left w:val="single" w:color="BBBBBB" w:sz="6" w:space="0"/>
-              <w:bottom w:val="single" w:color="BBBBBB" w:sz="6" w:space="0"/>
-              <w:right w:val="single" w:color="BBBBBB" w:sz="6" w:space="0"/>
-            </w:tcBorders>
-            <w:shd w:val="clear" w:color="auto" w:fill="FFFFFF"/>
+            <w:tcW w:w="546" w:type="dxa"/>
+            <w:tcBorders>
+              <w:top w:val="single" w:color="BBBBBB" w:sz="6" w:space="0"/>
+              <w:left w:val="single" w:color="BBBBBB" w:sz="6" w:space="0"/>
+              <w:bottom w:val="single" w:color="BBBBBB" w:sz="6" w:space="0"/>
+              <w:right w:val="single" w:color="BBBBBB" w:sz="6" w:space="0"/>
+            </w:tcBorders>
+            <w:shd w:val="clear" w:color="auto" w:fill="FFFFFF" w:themeFill="background1"/>
             <w:tcMar>
               <w:top w:w="80" w:type="dxa"/>
               <w:left w:w="140" w:type="dxa"/>
@@ -2091,14 +2272,14 @@
         </w:tc>
         <w:tc>
           <w:tcPr>
-            <w:tcW w:w="0" w:type="auto"/>
-            <w:tcBorders>
-              <w:top w:val="single" w:color="BBBBBB" w:sz="6" w:space="0"/>
-              <w:left w:val="single" w:color="BBBBBB" w:sz="6" w:space="0"/>
-              <w:bottom w:val="single" w:color="BBBBBB" w:sz="6" w:space="0"/>
-              <w:right w:val="single" w:color="BBBBBB" w:sz="6" w:space="0"/>
-            </w:tcBorders>
-            <w:shd w:val="clear" w:color="auto" w:fill="FFFFFF"/>
+            <w:tcW w:w="2407" w:type="dxa"/>
+            <w:tcBorders>
+              <w:top w:val="single" w:color="BBBBBB" w:sz="6" w:space="0"/>
+              <w:left w:val="single" w:color="BBBBBB" w:sz="6" w:space="0"/>
+              <w:bottom w:val="single" w:color="BBBBBB" w:sz="6" w:space="0"/>
+              <w:right w:val="single" w:color="BBBBBB" w:sz="6" w:space="0"/>
+            </w:tcBorders>
+            <w:shd w:val="clear" w:color="auto" w:fill="FFFFFF" w:themeFill="background1"/>
             <w:tcMar>
               <w:top w:w="80" w:type="dxa"/>
               <w:left w:w="140" w:type="dxa"/>
@@ -2120,14 +2301,14 @@
         </w:tc>
         <w:tc>
           <w:tcPr>
-            <w:tcW w:w="0" w:type="auto"/>
-            <w:tcBorders>
-              <w:top w:val="single" w:color="BBBBBB" w:sz="6" w:space="0"/>
-              <w:left w:val="single" w:color="BBBBBB" w:sz="6" w:space="0"/>
-              <w:bottom w:val="single" w:color="BBBBBB" w:sz="6" w:space="0"/>
-              <w:right w:val="single" w:color="BBBBBB" w:sz="6" w:space="0"/>
-            </w:tcBorders>
-            <w:shd w:val="clear" w:color="auto" w:fill="FFFFFF"/>
+            <w:tcW w:w="2248" w:type="dxa"/>
+            <w:tcBorders>
+              <w:top w:val="single" w:color="BBBBBB" w:sz="6" w:space="0"/>
+              <w:left w:val="single" w:color="BBBBBB" w:sz="6" w:space="0"/>
+              <w:bottom w:val="single" w:color="BBBBBB" w:sz="6" w:space="0"/>
+              <w:right w:val="single" w:color="BBBBBB" w:sz="6" w:space="0"/>
+            </w:tcBorders>
+            <w:shd w:val="clear" w:color="auto" w:fill="FFFFFF" w:themeFill="background1"/>
             <w:tcMar>
               <w:top w:w="80" w:type="dxa"/>
               <w:left w:w="140" w:type="dxa"/>
@@ -2149,14 +2330,14 @@
         </w:tc>
         <w:tc>
           <w:tcPr>
-            <w:tcW w:w="0" w:type="auto"/>
-            <w:tcBorders>
-              <w:top w:val="single" w:color="BBBBBB" w:sz="6" w:space="0"/>
-              <w:left w:val="single" w:color="BBBBBB" w:sz="6" w:space="0"/>
-              <w:bottom w:val="single" w:color="BBBBBB" w:sz="6" w:space="0"/>
-              <w:right w:val="single" w:color="BBBBBB" w:sz="6" w:space="0"/>
-            </w:tcBorders>
-            <w:shd w:val="clear" w:color="auto" w:fill="FFFFFF"/>
+            <w:tcW w:w="743" w:type="dxa"/>
+            <w:tcBorders>
+              <w:top w:val="single" w:color="BBBBBB" w:sz="6" w:space="0"/>
+              <w:left w:val="single" w:color="BBBBBB" w:sz="6" w:space="0"/>
+              <w:bottom w:val="single" w:color="BBBBBB" w:sz="6" w:space="0"/>
+              <w:right w:val="single" w:color="BBBBBB" w:sz="6" w:space="0"/>
+            </w:tcBorders>
+            <w:shd w:val="clear" w:color="auto" w:fill="FFFFFF" w:themeFill="background1"/>
             <w:tcMar>
               <w:top w:w="80" w:type="dxa"/>
               <w:left w:w="140" w:type="dxa"/>
@@ -2178,14 +2359,14 @@
         </w:tc>
         <w:tc>
           <w:tcPr>
-            <w:tcW w:w="0" w:type="auto"/>
-            <w:tcBorders>
-              <w:top w:val="single" w:color="BBBBBB" w:sz="6" w:space="0"/>
-              <w:left w:val="single" w:color="BBBBBB" w:sz="6" w:space="0"/>
-              <w:bottom w:val="single" w:color="BBBBBB" w:sz="6" w:space="0"/>
-              <w:right w:val="single" w:color="BBBBBB" w:sz="6" w:space="0"/>
-            </w:tcBorders>
-            <w:shd w:val="clear" w:color="auto" w:fill="FFFFFF"/>
+            <w:tcW w:w="1291" w:type="dxa"/>
+            <w:tcBorders>
+              <w:top w:val="single" w:color="BBBBBB" w:sz="6" w:space="0"/>
+              <w:left w:val="single" w:color="BBBBBB" w:sz="6" w:space="0"/>
+              <w:bottom w:val="single" w:color="BBBBBB" w:sz="6" w:space="0"/>
+              <w:right w:val="single" w:color="BBBBBB" w:sz="6" w:space="0"/>
+            </w:tcBorders>
+            <w:shd w:val="clear" w:color="auto" w:fill="FFFFFF" w:themeFill="background1"/>
             <w:tcMar>
               <w:top w:w="80" w:type="dxa"/>
               <w:left w:w="140" w:type="dxa"/>
@@ -2207,30 +2388,46 @@
         </w:tc>
         <w:tc>
           <w:tcPr>
-            <w:tcW w:w="0" w:type="auto"/>
-            <w:tcBorders>
-              <w:top w:val="single" w:color="BBBBBB" w:sz="6" w:space="0"/>
-              <w:left w:val="single" w:color="BBBBBB" w:sz="6" w:space="0"/>
-              <w:bottom w:val="single" w:color="BBBBBB" w:sz="6" w:space="0"/>
-              <w:right w:val="single" w:color="BBBBBB" w:sz="6" w:space="0"/>
-            </w:tcBorders>
-            <w:shd w:val="clear" w:color="auto" w:fill="FFFFFF"/>
-            <w:tcMar>
-              <w:top w:w="80" w:type="dxa"/>
-              <w:left w:w="140" w:type="dxa"/>
-              <w:bottom w:w="80" w:type="dxa"/>
-              <w:right w:w="140" w:type="dxa"/>
-            </w:tcMar>
-            <w:vAlign w:val="center"/>
-          </w:tcPr>
-          <w:p>
-            <w:r>
-              <w:rPr>
-                <w:color w:val="404040"/>
+            <w:tcW w:w="2125" w:type="dxa"/>
+            <w:tcBorders>
+              <w:top w:val="single" w:color="BBBBBB" w:sz="6" w:space="0"/>
+              <w:left w:val="single" w:color="BBBBBB" w:sz="6" w:space="0"/>
+              <w:bottom w:val="single" w:color="BBBBBB" w:sz="6" w:space="0"/>
+              <w:right w:val="single" w:color="BBBBBB" w:sz="6" w:space="0"/>
+            </w:tcBorders>
+            <w:shd w:val="clear" w:color="auto" w:fill="FFFFFF" w:themeFill="background1"/>
+            <w:tcMar>
+              <w:top w:w="80" w:type="dxa"/>
+              <w:left w:w="140" w:type="dxa"/>
+              <w:bottom w:w="80" w:type="dxa"/>
+              <w:right w:w="140" w:type="dxa"/>
+            </w:tcMar>
+            <w:vAlign w:val="center"/>
+          </w:tcPr>
+          <w:p>
+            <w:r>
+              <w:rPr>
+                <w:color w:val="404040" w:themeColor="text1" w:themeTint="BF" w:themeShade="FF"/>
                 <w:sz w:val="17"/>
                 <w:szCs w:val="17"/>
               </w:rPr>
-              <w:t>Max pressure (PSIG), APC (BOPD)</w:t>
+              <w:t xml:space="preserve">Max pressure (PSIG), </w:t>
+            </w:r>
+            <w:r>
+              <w:rPr>
+                <w:color w:val="404040" w:themeColor="text1" w:themeTint="BF" w:themeShade="FF"/>
+                <w:sz w:val="17"/>
+                <w:szCs w:val="17"/>
+              </w:rPr>
+              <w:t xml:space="preserve">Daily Prod </w:t>
+            </w:r>
+            <w:r>
+              <w:rPr>
+                <w:color w:val="404040" w:themeColor="text1" w:themeTint="BF" w:themeShade="FF"/>
+                <w:sz w:val="17"/>
+                <w:szCs w:val="17"/>
+              </w:rPr>
+              <w:t>(BOPD)</w:t>
             </w:r>
           </w:p>
         </w:tc>
@@ -2244,7 +2441,7 @@
         </w:tblPrEx>
         <w:tc>
           <w:tcPr>
-            <w:tcW w:w="0" w:type="auto"/>
+            <w:tcW w:w="546" w:type="dxa"/>
             <w:tcBorders>
               <w:top w:val="single" w:color="BBBBBB" w:sz="6" w:space="0"/>
               <w:left w:val="single" w:color="BBBBBB" w:sz="6" w:space="0"/>
@@ -2275,7 +2472,7 @@
         </w:tc>
         <w:tc>
           <w:tcPr>
-            <w:tcW w:w="0" w:type="auto"/>
+            <w:tcW w:w="2407" w:type="dxa"/>
             <w:tcBorders>
               <w:top w:val="single" w:color="BBBBBB" w:sz="6" w:space="0"/>
               <w:left w:val="single" w:color="BBBBBB" w:sz="6" w:space="0"/>
@@ -2304,7 +2501,7 @@
         </w:tc>
         <w:tc>
           <w:tcPr>
-            <w:tcW w:w="0" w:type="auto"/>
+            <w:tcW w:w="2248" w:type="dxa"/>
             <w:tcBorders>
               <w:top w:val="single" w:color="BBBBBB" w:sz="6" w:space="0"/>
               <w:left w:val="single" w:color="BBBBBB" w:sz="6" w:space="0"/>
@@ -2333,7 +2530,7 @@
         </w:tc>
         <w:tc>
           <w:tcPr>
-            <w:tcW w:w="0" w:type="auto"/>
+            <w:tcW w:w="743" w:type="dxa"/>
             <w:tcBorders>
               <w:top w:val="single" w:color="BBBBBB" w:sz="6" w:space="0"/>
               <w:left w:val="single" w:color="BBBBBB" w:sz="6" w:space="0"/>
@@ -2362,7 +2559,7 @@
         </w:tc>
         <w:tc>
           <w:tcPr>
-            <w:tcW w:w="0" w:type="auto"/>
+            <w:tcW w:w="1291" w:type="dxa"/>
             <w:tcBorders>
               <w:top w:val="single" w:color="BBBBBB" w:sz="6" w:space="0"/>
               <w:left w:val="single" w:color="BBBBBB" w:sz="6" w:space="0"/>
@@ -2391,7 +2588,7 @@
         </w:tc>
         <w:tc>
           <w:tcPr>
-            <w:tcW w:w="0" w:type="auto"/>
+            <w:tcW w:w="2125" w:type="dxa"/>
             <w:tcBorders>
               <w:top w:val="single" w:color="BBBBBB" w:sz="6" w:space="0"/>
               <w:left w:val="single" w:color="BBBBBB" w:sz="6" w:space="0"/>
@@ -2428,14 +2625,14 @@
         </w:tblPrEx>
         <w:tc>
           <w:tcPr>
-            <w:tcW w:w="0" w:type="auto"/>
-            <w:tcBorders>
-              <w:top w:val="single" w:color="BBBBBB" w:sz="6" w:space="0"/>
-              <w:left w:val="single" w:color="BBBBBB" w:sz="6" w:space="0"/>
-              <w:bottom w:val="single" w:color="BBBBBB" w:sz="6" w:space="0"/>
-              <w:right w:val="single" w:color="BBBBBB" w:sz="6" w:space="0"/>
-            </w:tcBorders>
-            <w:shd w:val="clear" w:color="auto" w:fill="FFFFFF"/>
+            <w:tcW w:w="546" w:type="dxa"/>
+            <w:tcBorders>
+              <w:top w:val="single" w:color="BBBBBB" w:sz="6" w:space="0"/>
+              <w:left w:val="single" w:color="BBBBBB" w:sz="6" w:space="0"/>
+              <w:bottom w:val="single" w:color="BBBBBB" w:sz="6" w:space="0"/>
+              <w:right w:val="single" w:color="BBBBBB" w:sz="6" w:space="0"/>
+            </w:tcBorders>
+            <w:shd w:val="clear" w:color="auto" w:fill="FFFFFF" w:themeFill="background1"/>
             <w:tcMar>
               <w:top w:w="80" w:type="dxa"/>
               <w:left w:w="140" w:type="dxa"/>
@@ -2459,14 +2656,14 @@
         </w:tc>
         <w:tc>
           <w:tcPr>
-            <w:tcW w:w="0" w:type="auto"/>
-            <w:tcBorders>
-              <w:top w:val="single" w:color="BBBBBB" w:sz="6" w:space="0"/>
-              <w:left w:val="single" w:color="BBBBBB" w:sz="6" w:space="0"/>
-              <w:bottom w:val="single" w:color="BBBBBB" w:sz="6" w:space="0"/>
-              <w:right w:val="single" w:color="BBBBBB" w:sz="6" w:space="0"/>
-            </w:tcBorders>
-            <w:shd w:val="clear" w:color="auto" w:fill="FFFFFF"/>
+            <w:tcW w:w="2407" w:type="dxa"/>
+            <w:tcBorders>
+              <w:top w:val="single" w:color="BBBBBB" w:sz="6" w:space="0"/>
+              <w:left w:val="single" w:color="BBBBBB" w:sz="6" w:space="0"/>
+              <w:bottom w:val="single" w:color="BBBBBB" w:sz="6" w:space="0"/>
+              <w:right w:val="single" w:color="BBBBBB" w:sz="6" w:space="0"/>
+            </w:tcBorders>
+            <w:shd w:val="clear" w:color="auto" w:fill="FFFFFF" w:themeFill="background1"/>
             <w:tcMar>
               <w:top w:w="80" w:type="dxa"/>
               <w:left w:w="140" w:type="dxa"/>
@@ -2488,14 +2685,14 @@
         </w:tc>
         <w:tc>
           <w:tcPr>
-            <w:tcW w:w="0" w:type="auto"/>
-            <w:tcBorders>
-              <w:top w:val="single" w:color="BBBBBB" w:sz="6" w:space="0"/>
-              <w:left w:val="single" w:color="BBBBBB" w:sz="6" w:space="0"/>
-              <w:bottom w:val="single" w:color="BBBBBB" w:sz="6" w:space="0"/>
-              <w:right w:val="single" w:color="BBBBBB" w:sz="6" w:space="0"/>
-            </w:tcBorders>
-            <w:shd w:val="clear" w:color="auto" w:fill="FFFFFF"/>
+            <w:tcW w:w="2248" w:type="dxa"/>
+            <w:tcBorders>
+              <w:top w:val="single" w:color="BBBBBB" w:sz="6" w:space="0"/>
+              <w:left w:val="single" w:color="BBBBBB" w:sz="6" w:space="0"/>
+              <w:bottom w:val="single" w:color="BBBBBB" w:sz="6" w:space="0"/>
+              <w:right w:val="single" w:color="BBBBBB" w:sz="6" w:space="0"/>
+            </w:tcBorders>
+            <w:shd w:val="clear" w:color="auto" w:fill="FFFFFF" w:themeFill="background1"/>
             <w:tcMar>
               <w:top w:w="80" w:type="dxa"/>
               <w:left w:w="140" w:type="dxa"/>
@@ -2517,14 +2714,14 @@
         </w:tc>
         <w:tc>
           <w:tcPr>
-            <w:tcW w:w="0" w:type="auto"/>
-            <w:tcBorders>
-              <w:top w:val="single" w:color="BBBBBB" w:sz="6" w:space="0"/>
-              <w:left w:val="single" w:color="BBBBBB" w:sz="6" w:space="0"/>
-              <w:bottom w:val="single" w:color="BBBBBB" w:sz="6" w:space="0"/>
-              <w:right w:val="single" w:color="BBBBBB" w:sz="6" w:space="0"/>
-            </w:tcBorders>
-            <w:shd w:val="clear" w:color="auto" w:fill="FFFFFF"/>
+            <w:tcW w:w="743" w:type="dxa"/>
+            <w:tcBorders>
+              <w:top w:val="single" w:color="BBBBBB" w:sz="6" w:space="0"/>
+              <w:left w:val="single" w:color="BBBBBB" w:sz="6" w:space="0"/>
+              <w:bottom w:val="single" w:color="BBBBBB" w:sz="6" w:space="0"/>
+              <w:right w:val="single" w:color="BBBBBB" w:sz="6" w:space="0"/>
+            </w:tcBorders>
+            <w:shd w:val="clear" w:color="auto" w:fill="FFFFFF" w:themeFill="background1"/>
             <w:tcMar>
               <w:top w:w="80" w:type="dxa"/>
               <w:left w:w="140" w:type="dxa"/>
@@ -2546,14 +2743,14 @@
         </w:tc>
         <w:tc>
           <w:tcPr>
-            <w:tcW w:w="0" w:type="auto"/>
-            <w:tcBorders>
-              <w:top w:val="single" w:color="BBBBBB" w:sz="6" w:space="0"/>
-              <w:left w:val="single" w:color="BBBBBB" w:sz="6" w:space="0"/>
-              <w:bottom w:val="single" w:color="BBBBBB" w:sz="6" w:space="0"/>
-              <w:right w:val="single" w:color="BBBBBB" w:sz="6" w:space="0"/>
-            </w:tcBorders>
-            <w:shd w:val="clear" w:color="auto" w:fill="FFFFFF"/>
+            <w:tcW w:w="1291" w:type="dxa"/>
+            <w:tcBorders>
+              <w:top w:val="single" w:color="BBBBBB" w:sz="6" w:space="0"/>
+              <w:left w:val="single" w:color="BBBBBB" w:sz="6" w:space="0"/>
+              <w:bottom w:val="single" w:color="BBBBBB" w:sz="6" w:space="0"/>
+              <w:right w:val="single" w:color="BBBBBB" w:sz="6" w:space="0"/>
+            </w:tcBorders>
+            <w:shd w:val="clear" w:color="auto" w:fill="FFFFFF" w:themeFill="background1"/>
             <w:tcMar>
               <w:top w:w="80" w:type="dxa"/>
               <w:left w:w="140" w:type="dxa"/>
@@ -2575,14 +2772,14 @@
         </w:tc>
         <w:tc>
           <w:tcPr>
-            <w:tcW w:w="0" w:type="auto"/>
-            <w:tcBorders>
-              <w:top w:val="single" w:color="BBBBBB" w:sz="6" w:space="0"/>
-              <w:left w:val="single" w:color="BBBBBB" w:sz="6" w:space="0"/>
-              <w:bottom w:val="single" w:color="BBBBBB" w:sz="6" w:space="0"/>
-              <w:right w:val="single" w:color="BBBBBB" w:sz="6" w:space="0"/>
-            </w:tcBorders>
-            <w:shd w:val="clear" w:color="auto" w:fill="FFFFFF"/>
+            <w:tcW w:w="2125" w:type="dxa"/>
+            <w:tcBorders>
+              <w:top w:val="single" w:color="BBBBBB" w:sz="6" w:space="0"/>
+              <w:left w:val="single" w:color="BBBBBB" w:sz="6" w:space="0"/>
+              <w:bottom w:val="single" w:color="BBBBBB" w:sz="6" w:space="0"/>
+              <w:right w:val="single" w:color="BBBBBB" w:sz="6" w:space="0"/>
+            </w:tcBorders>
+            <w:shd w:val="clear" w:color="auto" w:fill="FFFFFF" w:themeFill="background1"/>
             <w:tcMar>
               <w:top w:w="80" w:type="dxa"/>
               <w:left w:w="140" w:type="dxa"/>
@@ -2612,7 +2809,7 @@
         </w:tblPrEx>
         <w:tc>
           <w:tcPr>
-            <w:tcW w:w="0" w:type="auto"/>
+            <w:tcW w:w="546" w:type="dxa"/>
             <w:tcBorders>
               <w:top w:val="single" w:color="BBBBBB" w:sz="6" w:space="0"/>
               <w:left w:val="single" w:color="BBBBBB" w:sz="6" w:space="0"/>
@@ -2643,7 +2840,7 @@
         </w:tc>
         <w:tc>
           <w:tcPr>
-            <w:tcW w:w="0" w:type="auto"/>
+            <w:tcW w:w="2407" w:type="dxa"/>
             <w:tcBorders>
               <w:top w:val="single" w:color="BBBBBB" w:sz="6" w:space="0"/>
               <w:left w:val="single" w:color="BBBBBB" w:sz="6" w:space="0"/>
@@ -2672,7 +2869,7 @@
         </w:tc>
         <w:tc>
           <w:tcPr>
-            <w:tcW w:w="0" w:type="auto"/>
+            <w:tcW w:w="2248" w:type="dxa"/>
             <w:tcBorders>
               <w:top w:val="single" w:color="BBBBBB" w:sz="6" w:space="0"/>
               <w:left w:val="single" w:color="BBBBBB" w:sz="6" w:space="0"/>
@@ -2701,7 +2898,7 @@
         </w:tc>
         <w:tc>
           <w:tcPr>
-            <w:tcW w:w="0" w:type="auto"/>
+            <w:tcW w:w="743" w:type="dxa"/>
             <w:tcBorders>
               <w:top w:val="single" w:color="BBBBBB" w:sz="6" w:space="0"/>
               <w:left w:val="single" w:color="BBBBBB" w:sz="6" w:space="0"/>
@@ -2730,7 +2927,7 @@
         </w:tc>
         <w:tc>
           <w:tcPr>
-            <w:tcW w:w="0" w:type="auto"/>
+            <w:tcW w:w="1291" w:type="dxa"/>
             <w:tcBorders>
               <w:top w:val="single" w:color="BBBBBB" w:sz="6" w:space="0"/>
               <w:left w:val="single" w:color="BBBBBB" w:sz="6" w:space="0"/>
@@ -2759,7 +2956,7 @@
         </w:tc>
         <w:tc>
           <w:tcPr>
-            <w:tcW w:w="0" w:type="auto"/>
+            <w:tcW w:w="2125" w:type="dxa"/>
             <w:tcBorders>
               <w:top w:val="single" w:color="BBBBBB" w:sz="6" w:space="0"/>
               <w:left w:val="single" w:color="BBBBBB" w:sz="6" w:space="0"/>
@@ -2796,14 +2993,14 @@
         </w:tblPrEx>
         <w:tc>
           <w:tcPr>
-            <w:tcW w:w="0" w:type="auto"/>
-            <w:tcBorders>
-              <w:top w:val="single" w:color="BBBBBB" w:sz="6" w:space="0"/>
-              <w:left w:val="single" w:color="BBBBBB" w:sz="6" w:space="0"/>
-              <w:bottom w:val="single" w:color="BBBBBB" w:sz="6" w:space="0"/>
-              <w:right w:val="single" w:color="BBBBBB" w:sz="6" w:space="0"/>
-            </w:tcBorders>
-            <w:shd w:val="clear" w:color="auto" w:fill="FFFFFF"/>
+            <w:tcW w:w="546" w:type="dxa"/>
+            <w:tcBorders>
+              <w:top w:val="single" w:color="BBBBBB" w:sz="6" w:space="0"/>
+              <w:left w:val="single" w:color="BBBBBB" w:sz="6" w:space="0"/>
+              <w:bottom w:val="single" w:color="BBBBBB" w:sz="6" w:space="0"/>
+              <w:right w:val="single" w:color="BBBBBB" w:sz="6" w:space="0"/>
+            </w:tcBorders>
+            <w:shd w:val="clear" w:color="auto" w:fill="FFFFFF" w:themeFill="background1"/>
             <w:tcMar>
               <w:top w:w="80" w:type="dxa"/>
               <w:left w:w="140" w:type="dxa"/>
@@ -2827,14 +3024,14 @@
         </w:tc>
         <w:tc>
           <w:tcPr>
-            <w:tcW w:w="0" w:type="auto"/>
-            <w:tcBorders>
-              <w:top w:val="single" w:color="BBBBBB" w:sz="6" w:space="0"/>
-              <w:left w:val="single" w:color="BBBBBB" w:sz="6" w:space="0"/>
-              <w:bottom w:val="single" w:color="BBBBBB" w:sz="6" w:space="0"/>
-              <w:right w:val="single" w:color="BBBBBB" w:sz="6" w:space="0"/>
-            </w:tcBorders>
-            <w:shd w:val="clear" w:color="auto" w:fill="FFFFFF"/>
+            <w:tcW w:w="2407" w:type="dxa"/>
+            <w:tcBorders>
+              <w:top w:val="single" w:color="BBBBBB" w:sz="6" w:space="0"/>
+              <w:left w:val="single" w:color="BBBBBB" w:sz="6" w:space="0"/>
+              <w:bottom w:val="single" w:color="BBBBBB" w:sz="6" w:space="0"/>
+              <w:right w:val="single" w:color="BBBBBB" w:sz="6" w:space="0"/>
+            </w:tcBorders>
+            <w:shd w:val="clear" w:color="auto" w:fill="FFFFFF" w:themeFill="background1"/>
             <w:tcMar>
               <w:top w:w="80" w:type="dxa"/>
               <w:left w:w="140" w:type="dxa"/>
@@ -2856,14 +3053,14 @@
         </w:tc>
         <w:tc>
           <w:tcPr>
-            <w:tcW w:w="0" w:type="auto"/>
-            <w:tcBorders>
-              <w:top w:val="single" w:color="BBBBBB" w:sz="6" w:space="0"/>
-              <w:left w:val="single" w:color="BBBBBB" w:sz="6" w:space="0"/>
-              <w:bottom w:val="single" w:color="BBBBBB" w:sz="6" w:space="0"/>
-              <w:right w:val="single" w:color="BBBBBB" w:sz="6" w:space="0"/>
-            </w:tcBorders>
-            <w:shd w:val="clear" w:color="auto" w:fill="FFFFFF"/>
+            <w:tcW w:w="2248" w:type="dxa"/>
+            <w:tcBorders>
+              <w:top w:val="single" w:color="BBBBBB" w:sz="6" w:space="0"/>
+              <w:left w:val="single" w:color="BBBBBB" w:sz="6" w:space="0"/>
+              <w:bottom w:val="single" w:color="BBBBBB" w:sz="6" w:space="0"/>
+              <w:right w:val="single" w:color="BBBBBB" w:sz="6" w:space="0"/>
+            </w:tcBorders>
+            <w:shd w:val="clear" w:color="auto" w:fill="FFFFFF" w:themeFill="background1"/>
             <w:tcMar>
               <w:top w:w="80" w:type="dxa"/>
               <w:left w:w="140" w:type="dxa"/>
@@ -2885,14 +3082,14 @@
         </w:tc>
         <w:tc>
           <w:tcPr>
-            <w:tcW w:w="0" w:type="auto"/>
-            <w:tcBorders>
-              <w:top w:val="single" w:color="BBBBBB" w:sz="6" w:space="0"/>
-              <w:left w:val="single" w:color="BBBBBB" w:sz="6" w:space="0"/>
-              <w:bottom w:val="single" w:color="BBBBBB" w:sz="6" w:space="0"/>
-              <w:right w:val="single" w:color="BBBBBB" w:sz="6" w:space="0"/>
-            </w:tcBorders>
-            <w:shd w:val="clear" w:color="auto" w:fill="FFFFFF"/>
+            <w:tcW w:w="743" w:type="dxa"/>
+            <w:tcBorders>
+              <w:top w:val="single" w:color="BBBBBB" w:sz="6" w:space="0"/>
+              <w:left w:val="single" w:color="BBBBBB" w:sz="6" w:space="0"/>
+              <w:bottom w:val="single" w:color="BBBBBB" w:sz="6" w:space="0"/>
+              <w:right w:val="single" w:color="BBBBBB" w:sz="6" w:space="0"/>
+            </w:tcBorders>
+            <w:shd w:val="clear" w:color="auto" w:fill="FFFFFF" w:themeFill="background1"/>
             <w:tcMar>
               <w:top w:w="80" w:type="dxa"/>
               <w:left w:w="140" w:type="dxa"/>
@@ -2914,14 +3111,14 @@
         </w:tc>
         <w:tc>
           <w:tcPr>
-            <w:tcW w:w="0" w:type="auto"/>
-            <w:tcBorders>
-              <w:top w:val="single" w:color="BBBBBB" w:sz="6" w:space="0"/>
-              <w:left w:val="single" w:color="BBBBBB" w:sz="6" w:space="0"/>
-              <w:bottom w:val="single" w:color="BBBBBB" w:sz="6" w:space="0"/>
-              <w:right w:val="single" w:color="BBBBBB" w:sz="6" w:space="0"/>
-            </w:tcBorders>
-            <w:shd w:val="clear" w:color="auto" w:fill="FFFFFF"/>
+            <w:tcW w:w="1291" w:type="dxa"/>
+            <w:tcBorders>
+              <w:top w:val="single" w:color="BBBBBB" w:sz="6" w:space="0"/>
+              <w:left w:val="single" w:color="BBBBBB" w:sz="6" w:space="0"/>
+              <w:bottom w:val="single" w:color="BBBBBB" w:sz="6" w:space="0"/>
+              <w:right w:val="single" w:color="BBBBBB" w:sz="6" w:space="0"/>
+            </w:tcBorders>
+            <w:shd w:val="clear" w:color="auto" w:fill="FFFFFF" w:themeFill="background1"/>
             <w:tcMar>
               <w:top w:w="80" w:type="dxa"/>
               <w:left w:w="140" w:type="dxa"/>
@@ -2943,14 +3140,14 @@
         </w:tc>
         <w:tc>
           <w:tcPr>
-            <w:tcW w:w="0" w:type="auto"/>
-            <w:tcBorders>
-              <w:top w:val="single" w:color="BBBBBB" w:sz="6" w:space="0"/>
-              <w:left w:val="single" w:color="BBBBBB" w:sz="6" w:space="0"/>
-              <w:bottom w:val="single" w:color="BBBBBB" w:sz="6" w:space="0"/>
-              <w:right w:val="single" w:color="BBBBBB" w:sz="6" w:space="0"/>
-            </w:tcBorders>
-            <w:shd w:val="clear" w:color="auto" w:fill="FFFFFF"/>
+            <w:tcW w:w="2125" w:type="dxa"/>
+            <w:tcBorders>
+              <w:top w:val="single" w:color="BBBBBB" w:sz="6" w:space="0"/>
+              <w:left w:val="single" w:color="BBBBBB" w:sz="6" w:space="0"/>
+              <w:bottom w:val="single" w:color="BBBBBB" w:sz="6" w:space="0"/>
+              <w:right w:val="single" w:color="BBBBBB" w:sz="6" w:space="0"/>
+            </w:tcBorders>
+            <w:shd w:val="clear" w:color="auto" w:fill="FFFFFF" w:themeFill="background1"/>
             <w:tcMar>
               <w:top w:w="80" w:type="dxa"/>
               <w:left w:w="140" w:type="dxa"/>
@@ -2980,7 +3177,7 @@
         </w:tblPrEx>
         <w:tc>
           <w:tcPr>
-            <w:tcW w:w="0" w:type="auto"/>
+            <w:tcW w:w="546" w:type="dxa"/>
             <w:tcBorders>
               <w:top w:val="single" w:color="BBBBBB" w:sz="6" w:space="0"/>
               <w:left w:val="single" w:color="BBBBBB" w:sz="6" w:space="0"/>
@@ -3011,7 +3208,7 @@
         </w:tc>
         <w:tc>
           <w:tcPr>
-            <w:tcW w:w="0" w:type="auto"/>
+            <w:tcW w:w="2407" w:type="dxa"/>
             <w:tcBorders>
               <w:top w:val="single" w:color="BBBBBB" w:sz="6" w:space="0"/>
               <w:left w:val="single" w:color="BBBBBB" w:sz="6" w:space="0"/>
@@ -3040,7 +3237,7 @@
         </w:tc>
         <w:tc>
           <w:tcPr>
-            <w:tcW w:w="0" w:type="auto"/>
+            <w:tcW w:w="2248" w:type="dxa"/>
             <w:tcBorders>
               <w:top w:val="single" w:color="BBBBBB" w:sz="6" w:space="0"/>
               <w:left w:val="single" w:color="BBBBBB" w:sz="6" w:space="0"/>
@@ -3069,7 +3266,7 @@
         </w:tc>
         <w:tc>
           <w:tcPr>
-            <w:tcW w:w="0" w:type="auto"/>
+            <w:tcW w:w="743" w:type="dxa"/>
             <w:tcBorders>
               <w:top w:val="single" w:color="BBBBBB" w:sz="6" w:space="0"/>
               <w:left w:val="single" w:color="BBBBBB" w:sz="6" w:space="0"/>
@@ -3098,7 +3295,7 @@
         </w:tc>
         <w:tc>
           <w:tcPr>
-            <w:tcW w:w="0" w:type="auto"/>
+            <w:tcW w:w="1291" w:type="dxa"/>
             <w:tcBorders>
               <w:top w:val="single" w:color="BBBBBB" w:sz="6" w:space="0"/>
               <w:left w:val="single" w:color="BBBBBB" w:sz="6" w:space="0"/>
@@ -3127,7 +3324,7 @@
         </w:tc>
         <w:tc>
           <w:tcPr>
-            <w:tcW w:w="0" w:type="auto"/>
+            <w:tcW w:w="2125" w:type="dxa"/>
             <w:tcBorders>
               <w:top w:val="single" w:color="BBBBBB" w:sz="6" w:space="0"/>
               <w:left w:val="single" w:color="BBBBBB" w:sz="6" w:space="0"/>
@@ -3164,14 +3361,14 @@
         </w:tblPrEx>
         <w:tc>
           <w:tcPr>
-            <w:tcW w:w="0" w:type="auto"/>
-            <w:tcBorders>
-              <w:top w:val="single" w:color="BBBBBB" w:sz="6" w:space="0"/>
-              <w:left w:val="single" w:color="BBBBBB" w:sz="6" w:space="0"/>
-              <w:bottom w:val="single" w:color="BBBBBB" w:sz="6" w:space="0"/>
-              <w:right w:val="single" w:color="BBBBBB" w:sz="6" w:space="0"/>
-            </w:tcBorders>
-            <w:shd w:val="clear" w:color="auto" w:fill="FFFFFF"/>
+            <w:tcW w:w="546" w:type="dxa"/>
+            <w:tcBorders>
+              <w:top w:val="single" w:color="BBBBBB" w:sz="6" w:space="0"/>
+              <w:left w:val="single" w:color="BBBBBB" w:sz="6" w:space="0"/>
+              <w:bottom w:val="single" w:color="BBBBBB" w:sz="6" w:space="0"/>
+              <w:right w:val="single" w:color="BBBBBB" w:sz="6" w:space="0"/>
+            </w:tcBorders>
+            <w:shd w:val="clear" w:color="auto" w:fill="FFFFFF" w:themeFill="background1"/>
             <w:tcMar>
               <w:top w:w="80" w:type="dxa"/>
               <w:left w:w="140" w:type="dxa"/>
@@ -3195,14 +3392,14 @@
         </w:tc>
         <w:tc>
           <w:tcPr>
-            <w:tcW w:w="0" w:type="auto"/>
-            <w:tcBorders>
-              <w:top w:val="single" w:color="BBBBBB" w:sz="6" w:space="0"/>
-              <w:left w:val="single" w:color="BBBBBB" w:sz="6" w:space="0"/>
-              <w:bottom w:val="single" w:color="BBBBBB" w:sz="6" w:space="0"/>
-              <w:right w:val="single" w:color="BBBBBB" w:sz="6" w:space="0"/>
-            </w:tcBorders>
-            <w:shd w:val="clear" w:color="auto" w:fill="FFFFFF"/>
+            <w:tcW w:w="2407" w:type="dxa"/>
+            <w:tcBorders>
+              <w:top w:val="single" w:color="BBBBBB" w:sz="6" w:space="0"/>
+              <w:left w:val="single" w:color="BBBBBB" w:sz="6" w:space="0"/>
+              <w:bottom w:val="single" w:color="BBBBBB" w:sz="6" w:space="0"/>
+              <w:right w:val="single" w:color="BBBBBB" w:sz="6" w:space="0"/>
+            </w:tcBorders>
+            <w:shd w:val="clear" w:color="auto" w:fill="FFFFFF" w:themeFill="background1"/>
             <w:tcMar>
               <w:top w:w="80" w:type="dxa"/>
               <w:left w:w="140" w:type="dxa"/>
@@ -3224,14 +3421,14 @@
         </w:tc>
         <w:tc>
           <w:tcPr>
-            <w:tcW w:w="0" w:type="auto"/>
-            <w:tcBorders>
-              <w:top w:val="single" w:color="BBBBBB" w:sz="6" w:space="0"/>
-              <w:left w:val="single" w:color="BBBBBB" w:sz="6" w:space="0"/>
-              <w:bottom w:val="single" w:color="BBBBBB" w:sz="6" w:space="0"/>
-              <w:right w:val="single" w:color="BBBBBB" w:sz="6" w:space="0"/>
-            </w:tcBorders>
-            <w:shd w:val="clear" w:color="auto" w:fill="FFFFFF"/>
+            <w:tcW w:w="2248" w:type="dxa"/>
+            <w:tcBorders>
+              <w:top w:val="single" w:color="BBBBBB" w:sz="6" w:space="0"/>
+              <w:left w:val="single" w:color="BBBBBB" w:sz="6" w:space="0"/>
+              <w:bottom w:val="single" w:color="BBBBBB" w:sz="6" w:space="0"/>
+              <w:right w:val="single" w:color="BBBBBB" w:sz="6" w:space="0"/>
+            </w:tcBorders>
+            <w:shd w:val="clear" w:color="auto" w:fill="FFFFFF" w:themeFill="background1"/>
             <w:tcMar>
               <w:top w:w="80" w:type="dxa"/>
               <w:left w:w="140" w:type="dxa"/>
@@ -3289,14 +3486,14 @@
         </w:tc>
         <w:tc>
           <w:tcPr>
-            <w:tcW w:w="0" w:type="auto"/>
-            <w:tcBorders>
-              <w:top w:val="single" w:color="BBBBBB" w:sz="6" w:space="0"/>
-              <w:left w:val="single" w:color="BBBBBB" w:sz="6" w:space="0"/>
-              <w:bottom w:val="single" w:color="BBBBBB" w:sz="6" w:space="0"/>
-              <w:right w:val="single" w:color="BBBBBB" w:sz="6" w:space="0"/>
-            </w:tcBorders>
-            <w:shd w:val="clear" w:color="auto" w:fill="FFFFFF"/>
+            <w:tcW w:w="743" w:type="dxa"/>
+            <w:tcBorders>
+              <w:top w:val="single" w:color="BBBBBB" w:sz="6" w:space="0"/>
+              <w:left w:val="single" w:color="BBBBBB" w:sz="6" w:space="0"/>
+              <w:bottom w:val="single" w:color="BBBBBB" w:sz="6" w:space="0"/>
+              <w:right w:val="single" w:color="BBBBBB" w:sz="6" w:space="0"/>
+            </w:tcBorders>
+            <w:shd w:val="clear" w:color="auto" w:fill="FFFFFF" w:themeFill="background1"/>
             <w:tcMar>
               <w:top w:w="80" w:type="dxa"/>
               <w:left w:w="140" w:type="dxa"/>
@@ -3318,14 +3515,14 @@
         </w:tc>
         <w:tc>
           <w:tcPr>
-            <w:tcW w:w="0" w:type="auto"/>
-            <w:tcBorders>
-              <w:top w:val="single" w:color="BBBBBB" w:sz="6" w:space="0"/>
-              <w:left w:val="single" w:color="BBBBBB" w:sz="6" w:space="0"/>
-              <w:bottom w:val="single" w:color="BBBBBB" w:sz="6" w:space="0"/>
-              <w:right w:val="single" w:color="BBBBBB" w:sz="6" w:space="0"/>
-            </w:tcBorders>
-            <w:shd w:val="clear" w:color="auto" w:fill="FFFFFF"/>
+            <w:tcW w:w="1291" w:type="dxa"/>
+            <w:tcBorders>
+              <w:top w:val="single" w:color="BBBBBB" w:sz="6" w:space="0"/>
+              <w:left w:val="single" w:color="BBBBBB" w:sz="6" w:space="0"/>
+              <w:bottom w:val="single" w:color="BBBBBB" w:sz="6" w:space="0"/>
+              <w:right w:val="single" w:color="BBBBBB" w:sz="6" w:space="0"/>
+            </w:tcBorders>
+            <w:shd w:val="clear" w:color="auto" w:fill="FFFFFF" w:themeFill="background1"/>
             <w:tcMar>
               <w:top w:w="80" w:type="dxa"/>
               <w:left w:w="140" w:type="dxa"/>
@@ -3347,14 +3544,14 @@
         </w:tc>
         <w:tc>
           <w:tcPr>
-            <w:tcW w:w="0" w:type="auto"/>
-            <w:tcBorders>
-              <w:top w:val="single" w:color="BBBBBB" w:sz="6" w:space="0"/>
-              <w:left w:val="single" w:color="BBBBBB" w:sz="6" w:space="0"/>
-              <w:bottom w:val="single" w:color="BBBBBB" w:sz="6" w:space="0"/>
-              <w:right w:val="single" w:color="BBBBBB" w:sz="6" w:space="0"/>
-            </w:tcBorders>
-            <w:shd w:val="clear" w:color="auto" w:fill="FFFFFF"/>
+            <w:tcW w:w="2125" w:type="dxa"/>
+            <w:tcBorders>
+              <w:top w:val="single" w:color="BBBBBB" w:sz="6" w:space="0"/>
+              <w:left w:val="single" w:color="BBBBBB" w:sz="6" w:space="0"/>
+              <w:bottom w:val="single" w:color="BBBBBB" w:sz="6" w:space="0"/>
+              <w:right w:val="single" w:color="BBBBBB" w:sz="6" w:space="0"/>
+            </w:tcBorders>
+            <w:shd w:val="clear" w:color="auto" w:fill="FFFFFF" w:themeFill="background1"/>
             <w:tcMar>
               <w:top w:w="80" w:type="dxa"/>
               <w:left w:w="140" w:type="dxa"/>
@@ -3384,7 +3581,7 @@
         </w:tblPrEx>
         <w:tc>
           <w:tcPr>
-            <w:tcW w:w="0" w:type="auto"/>
+            <w:tcW w:w="546" w:type="dxa"/>
             <w:tcBorders>
               <w:top w:val="single" w:color="BBBBBB" w:sz="6" w:space="0"/>
               <w:left w:val="single" w:color="BBBBBB" w:sz="6" w:space="0"/>
@@ -3415,7 +3612,7 @@
         </w:tc>
         <w:tc>
           <w:tcPr>
-            <w:tcW w:w="0" w:type="auto"/>
+            <w:tcW w:w="2407" w:type="dxa"/>
             <w:tcBorders>
               <w:top w:val="single" w:color="BBBBBB" w:sz="6" w:space="0"/>
               <w:left w:val="single" w:color="BBBBBB" w:sz="6" w:space="0"/>
@@ -3444,7 +3641,7 @@
         </w:tc>
         <w:tc>
           <w:tcPr>
-            <w:tcW w:w="0" w:type="auto"/>
+            <w:tcW w:w="2248" w:type="dxa"/>
             <w:tcBorders>
               <w:top w:val="single" w:color="BBBBBB" w:sz="6" w:space="0"/>
               <w:left w:val="single" w:color="BBBBBB" w:sz="6" w:space="0"/>
@@ -3473,7 +3670,7 @@
         </w:tc>
         <w:tc>
           <w:tcPr>
-            <w:tcW w:w="0" w:type="auto"/>
+            <w:tcW w:w="743" w:type="dxa"/>
             <w:tcBorders>
               <w:top w:val="single" w:color="BBBBBB" w:sz="6" w:space="0"/>
               <w:left w:val="single" w:color="BBBBBB" w:sz="6" w:space="0"/>
@@ -3502,7 +3699,7 @@
         </w:tc>
         <w:tc>
           <w:tcPr>
-            <w:tcW w:w="0" w:type="auto"/>
+            <w:tcW w:w="1291" w:type="dxa"/>
             <w:tcBorders>
               <w:top w:val="single" w:color="BBBBBB" w:sz="6" w:space="0"/>
               <w:left w:val="single" w:color="BBBBBB" w:sz="6" w:space="0"/>
@@ -3531,7 +3728,7 @@
         </w:tc>
         <w:tc>
           <w:tcPr>
-            <w:tcW w:w="0" w:type="auto"/>
+            <w:tcW w:w="2125" w:type="dxa"/>
             <w:tcBorders>
               <w:top w:val="single" w:color="BBBBBB" w:sz="6" w:space="0"/>
               <w:left w:val="single" w:color="BBBBBB" w:sz="6" w:space="0"/>
@@ -3568,14 +3765,14 @@
         </w:tblPrEx>
         <w:tc>
           <w:tcPr>
-            <w:tcW w:w="0" w:type="auto"/>
-            <w:tcBorders>
-              <w:top w:val="single" w:color="BBBBBB" w:sz="6" w:space="0"/>
-              <w:left w:val="single" w:color="BBBBBB" w:sz="6" w:space="0"/>
-              <w:bottom w:val="single" w:color="BBBBBB" w:sz="6" w:space="0"/>
-              <w:right w:val="single" w:color="BBBBBB" w:sz="6" w:space="0"/>
-            </w:tcBorders>
-            <w:shd w:val="clear" w:color="auto" w:fill="FFFFFF"/>
+            <w:tcW w:w="546" w:type="dxa"/>
+            <w:tcBorders>
+              <w:top w:val="single" w:color="BBBBBB" w:sz="6" w:space="0"/>
+              <w:left w:val="single" w:color="BBBBBB" w:sz="6" w:space="0"/>
+              <w:bottom w:val="single" w:color="BBBBBB" w:sz="6" w:space="0"/>
+              <w:right w:val="single" w:color="BBBBBB" w:sz="6" w:space="0"/>
+            </w:tcBorders>
+            <w:shd w:val="clear" w:color="auto" w:fill="FFFFFF" w:themeFill="background1"/>
             <w:tcMar>
               <w:top w:w="80" w:type="dxa"/>
               <w:left w:w="140" w:type="dxa"/>
@@ -3599,14 +3796,14 @@
         </w:tc>
         <w:tc>
           <w:tcPr>
-            <w:tcW w:w="0" w:type="auto"/>
-            <w:tcBorders>
-              <w:top w:val="single" w:color="BBBBBB" w:sz="6" w:space="0"/>
-              <w:left w:val="single" w:color="BBBBBB" w:sz="6" w:space="0"/>
-              <w:bottom w:val="single" w:color="BBBBBB" w:sz="6" w:space="0"/>
-              <w:right w:val="single" w:color="BBBBBB" w:sz="6" w:space="0"/>
-            </w:tcBorders>
-            <w:shd w:val="clear" w:color="auto" w:fill="FFFFFF"/>
+            <w:tcW w:w="2407" w:type="dxa"/>
+            <w:tcBorders>
+              <w:top w:val="single" w:color="BBBBBB" w:sz="6" w:space="0"/>
+              <w:left w:val="single" w:color="BBBBBB" w:sz="6" w:space="0"/>
+              <w:bottom w:val="single" w:color="BBBBBB" w:sz="6" w:space="0"/>
+              <w:right w:val="single" w:color="BBBBBB" w:sz="6" w:space="0"/>
+            </w:tcBorders>
+            <w:shd w:val="clear" w:color="auto" w:fill="FFFFFF" w:themeFill="background1"/>
             <w:tcMar>
               <w:top w:w="80" w:type="dxa"/>
               <w:left w:w="140" w:type="dxa"/>
@@ -3628,14 +3825,14 @@
         </w:tc>
         <w:tc>
           <w:tcPr>
-            <w:tcW w:w="0" w:type="auto"/>
-            <w:tcBorders>
-              <w:top w:val="single" w:color="BBBBBB" w:sz="6" w:space="0"/>
-              <w:left w:val="single" w:color="BBBBBB" w:sz="6" w:space="0"/>
-              <w:bottom w:val="single" w:color="BBBBBB" w:sz="6" w:space="0"/>
-              <w:right w:val="single" w:color="BBBBBB" w:sz="6" w:space="0"/>
-            </w:tcBorders>
-            <w:shd w:val="clear" w:color="auto" w:fill="FFFFFF"/>
+            <w:tcW w:w="2248" w:type="dxa"/>
+            <w:tcBorders>
+              <w:top w:val="single" w:color="BBBBBB" w:sz="6" w:space="0"/>
+              <w:left w:val="single" w:color="BBBBBB" w:sz="6" w:space="0"/>
+              <w:bottom w:val="single" w:color="BBBBBB" w:sz="6" w:space="0"/>
+              <w:right w:val="single" w:color="BBBBBB" w:sz="6" w:space="0"/>
+            </w:tcBorders>
+            <w:shd w:val="clear" w:color="auto" w:fill="FFFFFF" w:themeFill="background1"/>
             <w:tcMar>
               <w:top w:w="80" w:type="dxa"/>
               <w:left w:w="140" w:type="dxa"/>
@@ -3657,14 +3854,14 @@
         </w:tc>
         <w:tc>
           <w:tcPr>
-            <w:tcW w:w="0" w:type="auto"/>
-            <w:tcBorders>
-              <w:top w:val="single" w:color="BBBBBB" w:sz="6" w:space="0"/>
-              <w:left w:val="single" w:color="BBBBBB" w:sz="6" w:space="0"/>
-              <w:bottom w:val="single" w:color="BBBBBB" w:sz="6" w:space="0"/>
-              <w:right w:val="single" w:color="BBBBBB" w:sz="6" w:space="0"/>
-            </w:tcBorders>
-            <w:shd w:val="clear" w:color="auto" w:fill="FFFFFF"/>
+            <w:tcW w:w="743" w:type="dxa"/>
+            <w:tcBorders>
+              <w:top w:val="single" w:color="BBBBBB" w:sz="6" w:space="0"/>
+              <w:left w:val="single" w:color="BBBBBB" w:sz="6" w:space="0"/>
+              <w:bottom w:val="single" w:color="BBBBBB" w:sz="6" w:space="0"/>
+              <w:right w:val="single" w:color="BBBBBB" w:sz="6" w:space="0"/>
+            </w:tcBorders>
+            <w:shd w:val="clear" w:color="auto" w:fill="FFFFFF" w:themeFill="background1"/>
             <w:tcMar>
               <w:top w:w="80" w:type="dxa"/>
               <w:left w:w="140" w:type="dxa"/>
@@ -3686,14 +3883,14 @@
         </w:tc>
         <w:tc>
           <w:tcPr>
-            <w:tcW w:w="0" w:type="auto"/>
-            <w:tcBorders>
-              <w:top w:val="single" w:color="BBBBBB" w:sz="6" w:space="0"/>
-              <w:left w:val="single" w:color="BBBBBB" w:sz="6" w:space="0"/>
-              <w:bottom w:val="single" w:color="BBBBBB" w:sz="6" w:space="0"/>
-              <w:right w:val="single" w:color="BBBBBB" w:sz="6" w:space="0"/>
-            </w:tcBorders>
-            <w:shd w:val="clear" w:color="auto" w:fill="FFFFFF"/>
+            <w:tcW w:w="1291" w:type="dxa"/>
+            <w:tcBorders>
+              <w:top w:val="single" w:color="BBBBBB" w:sz="6" w:space="0"/>
+              <w:left w:val="single" w:color="BBBBBB" w:sz="6" w:space="0"/>
+              <w:bottom w:val="single" w:color="BBBBBB" w:sz="6" w:space="0"/>
+              <w:right w:val="single" w:color="BBBBBB" w:sz="6" w:space="0"/>
+            </w:tcBorders>
+            <w:shd w:val="clear" w:color="auto" w:fill="FFFFFF" w:themeFill="background1"/>
             <w:tcMar>
               <w:top w:w="80" w:type="dxa"/>
               <w:left w:w="140" w:type="dxa"/>
@@ -3715,14 +3912,14 @@
         </w:tc>
         <w:tc>
           <w:tcPr>
-            <w:tcW w:w="0" w:type="auto"/>
-            <w:tcBorders>
-              <w:top w:val="single" w:color="BBBBBB" w:sz="6" w:space="0"/>
-              <w:left w:val="single" w:color="BBBBBB" w:sz="6" w:space="0"/>
-              <w:bottom w:val="single" w:color="BBBBBB" w:sz="6" w:space="0"/>
-              <w:right w:val="single" w:color="BBBBBB" w:sz="6" w:space="0"/>
-            </w:tcBorders>
-            <w:shd w:val="clear" w:color="auto" w:fill="FFFFFF"/>
+            <w:tcW w:w="2125" w:type="dxa"/>
+            <w:tcBorders>
+              <w:top w:val="single" w:color="BBBBBB" w:sz="6" w:space="0"/>
+              <w:left w:val="single" w:color="BBBBBB" w:sz="6" w:space="0"/>
+              <w:bottom w:val="single" w:color="BBBBBB" w:sz="6" w:space="0"/>
+              <w:right w:val="single" w:color="BBBBBB" w:sz="6" w:space="0"/>
+            </w:tcBorders>
+            <w:shd w:val="clear" w:color="auto" w:fill="FFFFFF" w:themeFill="background1"/>
             <w:tcMar>
               <w:top w:w="80" w:type="dxa"/>
               <w:left w:w="140" w:type="dxa"/>
@@ -3752,7 +3949,7 @@
         </w:tblPrEx>
         <w:tc>
           <w:tcPr>
-            <w:tcW w:w="0" w:type="auto"/>
+            <w:tcW w:w="546" w:type="dxa"/>
             <w:tcBorders>
               <w:top w:val="single" w:color="BBBBBB" w:sz="6" w:space="0"/>
               <w:left w:val="single" w:color="BBBBBB" w:sz="6" w:space="0"/>
@@ -3783,7 +3980,7 @@
         </w:tc>
         <w:tc>
           <w:tcPr>
-            <w:tcW w:w="0" w:type="auto"/>
+            <w:tcW w:w="2407" w:type="dxa"/>
             <w:tcBorders>
               <w:top w:val="single" w:color="BBBBBB" w:sz="6" w:space="0"/>
               <w:left w:val="single" w:color="BBBBBB" w:sz="6" w:space="0"/>
@@ -3812,7 +4009,7 @@
         </w:tc>
         <w:tc>
           <w:tcPr>
-            <w:tcW w:w="0" w:type="auto"/>
+            <w:tcW w:w="2248" w:type="dxa"/>
             <w:tcBorders>
               <w:top w:val="single" w:color="BBBBBB" w:sz="6" w:space="0"/>
               <w:left w:val="single" w:color="BBBBBB" w:sz="6" w:space="0"/>
@@ -3841,7 +4038,7 @@
         </w:tc>
         <w:tc>
           <w:tcPr>
-            <w:tcW w:w="0" w:type="auto"/>
+            <w:tcW w:w="743" w:type="dxa"/>
             <w:tcBorders>
               <w:top w:val="single" w:color="BBBBBB" w:sz="6" w:space="0"/>
               <w:left w:val="single" w:color="BBBBBB" w:sz="6" w:space="0"/>
@@ -3870,7 +4067,7 @@
         </w:tc>
         <w:tc>
           <w:tcPr>
-            <w:tcW w:w="0" w:type="auto"/>
+            <w:tcW w:w="1291" w:type="dxa"/>
             <w:tcBorders>
               <w:top w:val="single" w:color="BBBBBB" w:sz="6" w:space="0"/>
               <w:left w:val="single" w:color="BBBBBB" w:sz="6" w:space="0"/>
@@ -3899,7 +4096,7 @@
         </w:tc>
         <w:tc>
           <w:tcPr>
-            <w:tcW w:w="0" w:type="auto"/>
+            <w:tcW w:w="2125" w:type="dxa"/>
             <w:tcBorders>
               <w:top w:val="single" w:color="BBBBBB" w:sz="6" w:space="0"/>
               <w:left w:val="single" w:color="BBBBBB" w:sz="6" w:space="0"/>
@@ -3936,14 +4133,14 @@
         </w:tblPrEx>
         <w:tc>
           <w:tcPr>
-            <w:tcW w:w="0" w:type="auto"/>
-            <w:tcBorders>
-              <w:top w:val="single" w:color="BBBBBB" w:sz="6" w:space="0"/>
-              <w:left w:val="single" w:color="BBBBBB" w:sz="6" w:space="0"/>
-              <w:bottom w:val="single" w:color="BBBBBB" w:sz="6" w:space="0"/>
-              <w:right w:val="single" w:color="BBBBBB" w:sz="6" w:space="0"/>
-            </w:tcBorders>
-            <w:shd w:val="clear" w:color="auto" w:fill="FFFFFF"/>
+            <w:tcW w:w="546" w:type="dxa"/>
+            <w:tcBorders>
+              <w:top w:val="single" w:color="BBBBBB" w:sz="6" w:space="0"/>
+              <w:left w:val="single" w:color="BBBBBB" w:sz="6" w:space="0"/>
+              <w:bottom w:val="single" w:color="BBBBBB" w:sz="6" w:space="0"/>
+              <w:right w:val="single" w:color="BBBBBB" w:sz="6" w:space="0"/>
+            </w:tcBorders>
+            <w:shd w:val="clear" w:color="auto" w:fill="FFFFFF" w:themeFill="background1"/>
             <w:tcMar>
               <w:top w:w="80" w:type="dxa"/>
               <w:left w:w="140" w:type="dxa"/>
@@ -3967,14 +4164,14 @@
         </w:tc>
         <w:tc>
           <w:tcPr>
-            <w:tcW w:w="0" w:type="auto"/>
-            <w:tcBorders>
-              <w:top w:val="single" w:color="BBBBBB" w:sz="6" w:space="0"/>
-              <w:left w:val="single" w:color="BBBBBB" w:sz="6" w:space="0"/>
-              <w:bottom w:val="single" w:color="BBBBBB" w:sz="6" w:space="0"/>
-              <w:right w:val="single" w:color="BBBBBB" w:sz="6" w:space="0"/>
-            </w:tcBorders>
-            <w:shd w:val="clear" w:color="auto" w:fill="FFFFFF"/>
+            <w:tcW w:w="2407" w:type="dxa"/>
+            <w:tcBorders>
+              <w:top w:val="single" w:color="BBBBBB" w:sz="6" w:space="0"/>
+              <w:left w:val="single" w:color="BBBBBB" w:sz="6" w:space="0"/>
+              <w:bottom w:val="single" w:color="BBBBBB" w:sz="6" w:space="0"/>
+              <w:right w:val="single" w:color="BBBBBB" w:sz="6" w:space="0"/>
+            </w:tcBorders>
+            <w:shd w:val="clear" w:color="auto" w:fill="FFFFFF" w:themeFill="background1"/>
             <w:tcMar>
               <w:top w:w="80" w:type="dxa"/>
               <w:left w:w="140" w:type="dxa"/>
@@ -3996,14 +4193,14 @@
         </w:tc>
         <w:tc>
           <w:tcPr>
-            <w:tcW w:w="0" w:type="auto"/>
-            <w:tcBorders>
-              <w:top w:val="single" w:color="BBBBBB" w:sz="6" w:space="0"/>
-              <w:left w:val="single" w:color="BBBBBB" w:sz="6" w:space="0"/>
-              <w:bottom w:val="single" w:color="BBBBBB" w:sz="6" w:space="0"/>
-              <w:right w:val="single" w:color="BBBBBB" w:sz="6" w:space="0"/>
-            </w:tcBorders>
-            <w:shd w:val="clear" w:color="auto" w:fill="FFFFFF"/>
+            <w:tcW w:w="2248" w:type="dxa"/>
+            <w:tcBorders>
+              <w:top w:val="single" w:color="BBBBBB" w:sz="6" w:space="0"/>
+              <w:left w:val="single" w:color="BBBBBB" w:sz="6" w:space="0"/>
+              <w:bottom w:val="single" w:color="BBBBBB" w:sz="6" w:space="0"/>
+              <w:right w:val="single" w:color="BBBBBB" w:sz="6" w:space="0"/>
+            </w:tcBorders>
+            <w:shd w:val="clear" w:color="auto" w:fill="FFFFFF" w:themeFill="background1"/>
             <w:tcMar>
               <w:top w:w="80" w:type="dxa"/>
               <w:left w:w="140" w:type="dxa"/>
@@ -4025,14 +4222,14 @@
         </w:tc>
         <w:tc>
           <w:tcPr>
-            <w:tcW w:w="0" w:type="auto"/>
-            <w:tcBorders>
-              <w:top w:val="single" w:color="BBBBBB" w:sz="6" w:space="0"/>
-              <w:left w:val="single" w:color="BBBBBB" w:sz="6" w:space="0"/>
-              <w:bottom w:val="single" w:color="BBBBBB" w:sz="6" w:space="0"/>
-              <w:right w:val="single" w:color="BBBBBB" w:sz="6" w:space="0"/>
-            </w:tcBorders>
-            <w:shd w:val="clear" w:color="auto" w:fill="FFFFFF"/>
+            <w:tcW w:w="743" w:type="dxa"/>
+            <w:tcBorders>
+              <w:top w:val="single" w:color="BBBBBB" w:sz="6" w:space="0"/>
+              <w:left w:val="single" w:color="BBBBBB" w:sz="6" w:space="0"/>
+              <w:bottom w:val="single" w:color="BBBBBB" w:sz="6" w:space="0"/>
+              <w:right w:val="single" w:color="BBBBBB" w:sz="6" w:space="0"/>
+            </w:tcBorders>
+            <w:shd w:val="clear" w:color="auto" w:fill="FFFFFF" w:themeFill="background1"/>
             <w:tcMar>
               <w:top w:w="80" w:type="dxa"/>
               <w:left w:w="140" w:type="dxa"/>
@@ -4054,14 +4251,14 @@
         </w:tc>
         <w:tc>
           <w:tcPr>
-            <w:tcW w:w="0" w:type="auto"/>
-            <w:tcBorders>
-              <w:top w:val="single" w:color="BBBBBB" w:sz="6" w:space="0"/>
-              <w:left w:val="single" w:color="BBBBBB" w:sz="6" w:space="0"/>
-              <w:bottom w:val="single" w:color="BBBBBB" w:sz="6" w:space="0"/>
-              <w:right w:val="single" w:color="BBBBBB" w:sz="6" w:space="0"/>
-            </w:tcBorders>
-            <w:shd w:val="clear" w:color="auto" w:fill="FFFFFF"/>
+            <w:tcW w:w="1291" w:type="dxa"/>
+            <w:tcBorders>
+              <w:top w:val="single" w:color="BBBBBB" w:sz="6" w:space="0"/>
+              <w:left w:val="single" w:color="BBBBBB" w:sz="6" w:space="0"/>
+              <w:bottom w:val="single" w:color="BBBBBB" w:sz="6" w:space="0"/>
+              <w:right w:val="single" w:color="BBBBBB" w:sz="6" w:space="0"/>
+            </w:tcBorders>
+            <w:shd w:val="clear" w:color="auto" w:fill="FFFFFF" w:themeFill="background1"/>
             <w:tcMar>
               <w:top w:w="80" w:type="dxa"/>
               <w:left w:w="140" w:type="dxa"/>
@@ -4083,14 +4280,14 @@
         </w:tc>
         <w:tc>
           <w:tcPr>
-            <w:tcW w:w="0" w:type="auto"/>
-            <w:tcBorders>
-              <w:top w:val="single" w:color="BBBBBB" w:sz="6" w:space="0"/>
-              <w:left w:val="single" w:color="BBBBBB" w:sz="6" w:space="0"/>
-              <w:bottom w:val="single" w:color="BBBBBB" w:sz="6" w:space="0"/>
-              <w:right w:val="single" w:color="BBBBBB" w:sz="6" w:space="0"/>
-            </w:tcBorders>
-            <w:shd w:val="clear" w:color="auto" w:fill="FFFFFF"/>
+            <w:tcW w:w="2125" w:type="dxa"/>
+            <w:tcBorders>
+              <w:top w:val="single" w:color="BBBBBB" w:sz="6" w:space="0"/>
+              <w:left w:val="single" w:color="BBBBBB" w:sz="6" w:space="0"/>
+              <w:bottom w:val="single" w:color="BBBBBB" w:sz="6" w:space="0"/>
+              <w:right w:val="single" w:color="BBBBBB" w:sz="6" w:space="0"/>
+            </w:tcBorders>
+            <w:shd w:val="clear" w:color="auto" w:fill="FFFFFF" w:themeFill="background1"/>
             <w:tcMar>
               <w:top w:w="80" w:type="dxa"/>
               <w:left w:w="140" w:type="dxa"/>
@@ -4120,7 +4317,7 @@
         </w:tblPrEx>
         <w:tc>
           <w:tcPr>
-            <w:tcW w:w="0" w:type="auto"/>
+            <w:tcW w:w="546" w:type="dxa"/>
             <w:tcBorders>
               <w:top w:val="single" w:color="BBBBBB" w:sz="6" w:space="0"/>
               <w:left w:val="single" w:color="BBBBBB" w:sz="6" w:space="0"/>
@@ -4151,7 +4348,7 @@
         </w:tc>
         <w:tc>
           <w:tcPr>
-            <w:tcW w:w="0" w:type="auto"/>
+            <w:tcW w:w="2407" w:type="dxa"/>
             <w:tcBorders>
               <w:top w:val="single" w:color="BBBBBB" w:sz="6" w:space="0"/>
               <w:left w:val="single" w:color="BBBBBB" w:sz="6" w:space="0"/>
@@ -4180,7 +4377,7 @@
         </w:tc>
         <w:tc>
           <w:tcPr>
-            <w:tcW w:w="0" w:type="auto"/>
+            <w:tcW w:w="2248" w:type="dxa"/>
             <w:tcBorders>
               <w:top w:val="single" w:color="BBBBBB" w:sz="6" w:space="0"/>
               <w:left w:val="single" w:color="BBBBBB" w:sz="6" w:space="0"/>
@@ -4209,7 +4406,7 @@
         </w:tc>
         <w:tc>
           <w:tcPr>
-            <w:tcW w:w="0" w:type="auto"/>
+            <w:tcW w:w="743" w:type="dxa"/>
             <w:tcBorders>
               <w:top w:val="single" w:color="BBBBBB" w:sz="6" w:space="0"/>
               <w:left w:val="single" w:color="BBBBBB" w:sz="6" w:space="0"/>
@@ -4238,7 +4435,7 @@
         </w:tc>
         <w:tc>
           <w:tcPr>
-            <w:tcW w:w="0" w:type="auto"/>
+            <w:tcW w:w="1291" w:type="dxa"/>
             <w:tcBorders>
               <w:top w:val="single" w:color="BBBBBB" w:sz="6" w:space="0"/>
               <w:left w:val="single" w:color="BBBBBB" w:sz="6" w:space="0"/>
@@ -4267,7 +4464,7 @@
         </w:tc>
         <w:tc>
           <w:tcPr>
-            <w:tcW w:w="0" w:type="auto"/>
+            <w:tcW w:w="2125" w:type="dxa"/>
             <w:tcBorders>
               <w:top w:val="single" w:color="BBBBBB" w:sz="6" w:space="0"/>
               <w:left w:val="single" w:color="BBBBBB" w:sz="6" w:space="0"/>
@@ -4304,14 +4501,14 @@
         </w:tblPrEx>
         <w:tc>
           <w:tcPr>
-            <w:tcW w:w="0" w:type="auto"/>
-            <w:tcBorders>
-              <w:top w:val="single" w:color="BBBBBB" w:sz="6" w:space="0"/>
-              <w:left w:val="single" w:color="BBBBBB" w:sz="6" w:space="0"/>
-              <w:bottom w:val="single" w:color="BBBBBB" w:sz="6" w:space="0"/>
-              <w:right w:val="single" w:color="BBBBBB" w:sz="6" w:space="0"/>
-            </w:tcBorders>
-            <w:shd w:val="clear" w:color="auto" w:fill="FFFFFF"/>
+            <w:tcW w:w="546" w:type="dxa"/>
+            <w:tcBorders>
+              <w:top w:val="single" w:color="BBBBBB" w:sz="6" w:space="0"/>
+              <w:left w:val="single" w:color="BBBBBB" w:sz="6" w:space="0"/>
+              <w:bottom w:val="single" w:color="BBBBBB" w:sz="6" w:space="0"/>
+              <w:right w:val="single" w:color="BBBBBB" w:sz="6" w:space="0"/>
+            </w:tcBorders>
+            <w:shd w:val="clear" w:color="auto" w:fill="FFFFFF" w:themeFill="background1"/>
             <w:tcMar>
               <w:top w:w="80" w:type="dxa"/>
               <w:left w:w="140" w:type="dxa"/>
@@ -4335,14 +4532,14 @@
         </w:tc>
         <w:tc>
           <w:tcPr>
-            <w:tcW w:w="0" w:type="auto"/>
-            <w:tcBorders>
-              <w:top w:val="single" w:color="BBBBBB" w:sz="6" w:space="0"/>
-              <w:left w:val="single" w:color="BBBBBB" w:sz="6" w:space="0"/>
-              <w:bottom w:val="single" w:color="BBBBBB" w:sz="6" w:space="0"/>
-              <w:right w:val="single" w:color="BBBBBB" w:sz="6" w:space="0"/>
-            </w:tcBorders>
-            <w:shd w:val="clear" w:color="auto" w:fill="FFFFFF"/>
+            <w:tcW w:w="2407" w:type="dxa"/>
+            <w:tcBorders>
+              <w:top w:val="single" w:color="BBBBBB" w:sz="6" w:space="0"/>
+              <w:left w:val="single" w:color="BBBBBB" w:sz="6" w:space="0"/>
+              <w:bottom w:val="single" w:color="BBBBBB" w:sz="6" w:space="0"/>
+              <w:right w:val="single" w:color="BBBBBB" w:sz="6" w:space="0"/>
+            </w:tcBorders>
+            <w:shd w:val="clear" w:color="auto" w:fill="FFFFFF" w:themeFill="background1"/>
             <w:tcMar>
               <w:top w:w="80" w:type="dxa"/>
               <w:left w:w="140" w:type="dxa"/>
@@ -4364,14 +4561,14 @@
         </w:tc>
         <w:tc>
           <w:tcPr>
-            <w:tcW w:w="0" w:type="auto"/>
-            <w:tcBorders>
-              <w:top w:val="single" w:color="BBBBBB" w:sz="6" w:space="0"/>
-              <w:left w:val="single" w:color="BBBBBB" w:sz="6" w:space="0"/>
-              <w:bottom w:val="single" w:color="BBBBBB" w:sz="6" w:space="0"/>
-              <w:right w:val="single" w:color="BBBBBB" w:sz="6" w:space="0"/>
-            </w:tcBorders>
-            <w:shd w:val="clear" w:color="auto" w:fill="FFFFFF"/>
+            <w:tcW w:w="2248" w:type="dxa"/>
+            <w:tcBorders>
+              <w:top w:val="single" w:color="BBBBBB" w:sz="6" w:space="0"/>
+              <w:left w:val="single" w:color="BBBBBB" w:sz="6" w:space="0"/>
+              <w:bottom w:val="single" w:color="BBBBBB" w:sz="6" w:space="0"/>
+              <w:right w:val="single" w:color="BBBBBB" w:sz="6" w:space="0"/>
+            </w:tcBorders>
+            <w:shd w:val="clear" w:color="auto" w:fill="FFFFFF" w:themeFill="background1"/>
             <w:tcMar>
               <w:top w:w="80" w:type="dxa"/>
               <w:left w:w="140" w:type="dxa"/>
@@ -4393,14 +4590,14 @@
         </w:tc>
         <w:tc>
           <w:tcPr>
-            <w:tcW w:w="0" w:type="auto"/>
-            <w:tcBorders>
-              <w:top w:val="single" w:color="BBBBBB" w:sz="6" w:space="0"/>
-              <w:left w:val="single" w:color="BBBBBB" w:sz="6" w:space="0"/>
-              <w:bottom w:val="single" w:color="BBBBBB" w:sz="6" w:space="0"/>
-              <w:right w:val="single" w:color="BBBBBB" w:sz="6" w:space="0"/>
-            </w:tcBorders>
-            <w:shd w:val="clear" w:color="auto" w:fill="FFFFFF"/>
+            <w:tcW w:w="743" w:type="dxa"/>
+            <w:tcBorders>
+              <w:top w:val="single" w:color="BBBBBB" w:sz="6" w:space="0"/>
+              <w:left w:val="single" w:color="BBBBBB" w:sz="6" w:space="0"/>
+              <w:bottom w:val="single" w:color="BBBBBB" w:sz="6" w:space="0"/>
+              <w:right w:val="single" w:color="BBBBBB" w:sz="6" w:space="0"/>
+            </w:tcBorders>
+            <w:shd w:val="clear" w:color="auto" w:fill="FFFFFF" w:themeFill="background1"/>
             <w:tcMar>
               <w:top w:w="80" w:type="dxa"/>
               <w:left w:w="140" w:type="dxa"/>
@@ -4422,14 +4619,14 @@
         </w:tc>
         <w:tc>
           <w:tcPr>
-            <w:tcW w:w="0" w:type="auto"/>
-            <w:tcBorders>
-              <w:top w:val="single" w:color="BBBBBB" w:sz="6" w:space="0"/>
-              <w:left w:val="single" w:color="BBBBBB" w:sz="6" w:space="0"/>
-              <w:bottom w:val="single" w:color="BBBBBB" w:sz="6" w:space="0"/>
-              <w:right w:val="single" w:color="BBBBBB" w:sz="6" w:space="0"/>
-            </w:tcBorders>
-            <w:shd w:val="clear" w:color="auto" w:fill="FFFFFF"/>
+            <w:tcW w:w="1291" w:type="dxa"/>
+            <w:tcBorders>
+              <w:top w:val="single" w:color="BBBBBB" w:sz="6" w:space="0"/>
+              <w:left w:val="single" w:color="BBBBBB" w:sz="6" w:space="0"/>
+              <w:bottom w:val="single" w:color="BBBBBB" w:sz="6" w:space="0"/>
+              <w:right w:val="single" w:color="BBBBBB" w:sz="6" w:space="0"/>
+            </w:tcBorders>
+            <w:shd w:val="clear" w:color="auto" w:fill="FFFFFF" w:themeFill="background1"/>
             <w:tcMar>
               <w:top w:w="80" w:type="dxa"/>
               <w:left w:w="140" w:type="dxa"/>
@@ -4451,14 +4648,14 @@
         </w:tc>
         <w:tc>
           <w:tcPr>
-            <w:tcW w:w="0" w:type="auto"/>
-            <w:tcBorders>
-              <w:top w:val="single" w:color="BBBBBB" w:sz="6" w:space="0"/>
-              <w:left w:val="single" w:color="BBBBBB" w:sz="6" w:space="0"/>
-              <w:bottom w:val="single" w:color="BBBBBB" w:sz="6" w:space="0"/>
-              <w:right w:val="single" w:color="BBBBBB" w:sz="6" w:space="0"/>
-            </w:tcBorders>
-            <w:shd w:val="clear" w:color="auto" w:fill="FFFFFF"/>
+            <w:tcW w:w="2125" w:type="dxa"/>
+            <w:tcBorders>
+              <w:top w:val="single" w:color="BBBBBB" w:sz="6" w:space="0"/>
+              <w:left w:val="single" w:color="BBBBBB" w:sz="6" w:space="0"/>
+              <w:bottom w:val="single" w:color="BBBBBB" w:sz="6" w:space="0"/>
+              <w:right w:val="single" w:color="BBBBBB" w:sz="6" w:space="0"/>
+            </w:tcBorders>
+            <w:shd w:val="clear" w:color="auto" w:fill="FFFFFF" w:themeFill="background1"/>
             <w:tcMar>
               <w:top w:w="80" w:type="dxa"/>
               <w:left w:w="140" w:type="dxa"/>
@@ -4488,7 +4685,7 @@
         </w:tblPrEx>
         <w:tc>
           <w:tcPr>
-            <w:tcW w:w="0" w:type="auto"/>
+            <w:tcW w:w="546" w:type="dxa"/>
             <w:tcBorders>
               <w:top w:val="single" w:color="BBBBBB" w:sz="6" w:space="0"/>
               <w:left w:val="single" w:color="BBBBBB" w:sz="6" w:space="0"/>
@@ -4519,7 +4716,7 @@
         </w:tc>
         <w:tc>
           <w:tcPr>
-            <w:tcW w:w="0" w:type="auto"/>
+            <w:tcW w:w="2407" w:type="dxa"/>
             <w:tcBorders>
               <w:top w:val="single" w:color="BBBBBB" w:sz="6" w:space="0"/>
               <w:left w:val="single" w:color="BBBBBB" w:sz="6" w:space="0"/>
@@ -4548,7 +4745,7 @@
         </w:tc>
         <w:tc>
           <w:tcPr>
-            <w:tcW w:w="0" w:type="auto"/>
+            <w:tcW w:w="2248" w:type="dxa"/>
             <w:tcBorders>
               <w:top w:val="single" w:color="BBBBBB" w:sz="6" w:space="0"/>
               <w:left w:val="single" w:color="BBBBBB" w:sz="6" w:space="0"/>
@@ -4577,7 +4774,7 @@
         </w:tc>
         <w:tc>
           <w:tcPr>
-            <w:tcW w:w="0" w:type="auto"/>
+            <w:tcW w:w="743" w:type="dxa"/>
             <w:tcBorders>
               <w:top w:val="single" w:color="BBBBBB" w:sz="6" w:space="0"/>
               <w:left w:val="single" w:color="BBBBBB" w:sz="6" w:space="0"/>
@@ -4606,7 +4803,7 @@
         </w:tc>
         <w:tc>
           <w:tcPr>
-            <w:tcW w:w="0" w:type="auto"/>
+            <w:tcW w:w="1291" w:type="dxa"/>
             <w:tcBorders>
               <w:top w:val="single" w:color="BBBBBB" w:sz="6" w:space="0"/>
               <w:left w:val="single" w:color="BBBBBB" w:sz="6" w:space="0"/>
@@ -4635,7 +4832,7 @@
         </w:tc>
         <w:tc>
           <w:tcPr>
-            <w:tcW w:w="0" w:type="auto"/>
+            <w:tcW w:w="2125" w:type="dxa"/>
             <w:tcBorders>
               <w:top w:val="single" w:color="BBBBBB" w:sz="6" w:space="0"/>
               <w:left w:val="single" w:color="BBBBBB" w:sz="6" w:space="0"/>
@@ -4654,7 +4851,7 @@
           <w:p>
             <w:r>
               <w:rPr>
-                <w:color w:val="404040"/>
+                <w:color w:val="404040" w:themeColor="text1" w:themeTint="BF" w:themeShade="FF"/>
                 <w:sz w:val="17"/>
                 <w:szCs w:val="17"/>
               </w:rPr>
@@ -4815,7 +5012,7 @@
               <w:bottom w:val="single" w:color="BBBBBB" w:sz="6" w:space="0"/>
               <w:right w:val="single" w:color="BBBBBB" w:sz="6" w:space="0"/>
             </w:tcBorders>
-            <w:shd w:val="clear" w:color="auto" w:fill="FFFFFF"/>
+            <w:shd w:val="clear" w:color="auto" w:fill="FFFFFF" w:themeFill="background1"/>
             <w:tcMar>
               <w:top w:w="80" w:type="dxa"/>
               <w:left w:w="140" w:type="dxa"/>
@@ -4846,7 +5043,7 @@
               <w:bottom w:val="single" w:color="BBBBBB" w:sz="6" w:space="0"/>
               <w:right w:val="single" w:color="BBBBBB" w:sz="6" w:space="0"/>
             </w:tcBorders>
-            <w:shd w:val="clear" w:color="auto" w:fill="FFFFFF"/>
+            <w:shd w:val="clear" w:color="auto" w:fill="FFFFFF" w:themeFill="background1"/>
             <w:tcMar>
               <w:top w:w="80" w:type="dxa"/>
               <w:left w:w="140" w:type="dxa"/>
@@ -5005,7 +5202,7 @@
               <w:bottom w:val="single" w:color="BBBBBB" w:sz="6" w:space="0"/>
               <w:right w:val="single" w:color="BBBBBB" w:sz="6" w:space="0"/>
             </w:tcBorders>
-            <w:shd w:val="clear" w:color="auto" w:fill="FFFFFF"/>
+            <w:shd w:val="clear" w:color="auto" w:fill="FFFFFF" w:themeFill="background1"/>
             <w:tcMar>
               <w:top w:w="80" w:type="dxa"/>
               <w:left w:w="140" w:type="dxa"/>
@@ -5048,7 +5245,7 @@
               <w:bottom w:val="single" w:color="BBBBBB" w:sz="6" w:space="0"/>
               <w:right w:val="single" w:color="BBBBBB" w:sz="6" w:space="0"/>
             </w:tcBorders>
-            <w:shd w:val="clear" w:color="auto" w:fill="FFFFFF"/>
+            <w:shd w:val="clear" w:color="auto" w:fill="FFFFFF" w:themeFill="background1"/>
             <w:tcMar>
               <w:top w:w="80" w:type="dxa"/>
               <w:left w:w="140" w:type="dxa"/>
@@ -5347,7 +5544,7 @@
               <w:bottom w:val="single" w:color="BBBBBB" w:sz="6" w:space="0"/>
               <w:right w:val="single" w:color="BBBBBB" w:sz="6" w:space="0"/>
             </w:tcBorders>
-            <w:shd w:val="clear" w:color="auto" w:fill="FFFFFF"/>
+            <w:shd w:val="clear" w:color="auto" w:fill="FFFFFF" w:themeFill="background1"/>
             <w:tcMar>
               <w:top w:w="80" w:type="dxa"/>
               <w:left w:w="140" w:type="dxa"/>
@@ -5378,7 +5575,7 @@
               <w:bottom w:val="single" w:color="BBBBBB" w:sz="6" w:space="0"/>
               <w:right w:val="single" w:color="BBBBBB" w:sz="6" w:space="0"/>
             </w:tcBorders>
-            <w:shd w:val="clear" w:color="auto" w:fill="FFFFFF"/>
+            <w:shd w:val="clear" w:color="auto" w:fill="FFFFFF" w:themeFill="background1"/>
             <w:tcMar>
               <w:top w:w="80" w:type="dxa"/>
               <w:left w:w="140" w:type="dxa"/>
@@ -5591,7 +5788,7 @@
               <w:bottom w:val="single" w:color="BBBBBB" w:sz="6" w:space="0"/>
               <w:right w:val="single" w:color="BBBBBB" w:sz="6" w:space="0"/>
             </w:tcBorders>
-            <w:shd w:val="clear" w:color="auto" w:fill="FFFFFF"/>
+            <w:shd w:val="clear" w:color="auto" w:fill="FFFFFF" w:themeFill="background1"/>
             <w:tcMar>
               <w:top w:w="80" w:type="dxa"/>
               <w:left w:w="140" w:type="dxa"/>
@@ -5622,7 +5819,7 @@
               <w:bottom w:val="single" w:color="BBBBBB" w:sz="6" w:space="0"/>
               <w:right w:val="single" w:color="BBBBBB" w:sz="6" w:space="0"/>
             </w:tcBorders>
-            <w:shd w:val="clear" w:color="auto" w:fill="FFFFFF"/>
+            <w:shd w:val="clear" w:color="auto" w:fill="FFFFFF" w:themeFill="background1"/>
             <w:tcMar>
               <w:top w:w="80" w:type="dxa"/>
               <w:left w:w="140" w:type="dxa"/>
@@ -5781,7 +5978,7 @@
               <w:bottom w:val="single" w:color="BBBBBB" w:sz="6" w:space="0"/>
               <w:right w:val="single" w:color="BBBBBB" w:sz="6" w:space="0"/>
             </w:tcBorders>
-            <w:shd w:val="clear" w:color="auto" w:fill="FFFFFF"/>
+            <w:shd w:val="clear" w:color="auto" w:fill="FFFFFF" w:themeFill="background1"/>
             <w:tcMar>
               <w:top w:w="80" w:type="dxa"/>
               <w:left w:w="140" w:type="dxa"/>
@@ -5812,7 +6009,7 @@
               <w:bottom w:val="single" w:color="BBBBBB" w:sz="6" w:space="0"/>
               <w:right w:val="single" w:color="BBBBBB" w:sz="6" w:space="0"/>
             </w:tcBorders>
-            <w:shd w:val="clear" w:color="auto" w:fill="FFFFFF"/>
+            <w:shd w:val="clear" w:color="auto" w:fill="FFFFFF" w:themeFill="background1"/>
             <w:tcMar>
               <w:top w:w="80" w:type="dxa"/>
               <w:left w:w="140" w:type="dxa"/>
@@ -5926,13 +6123,36 @@
             <w:vAlign w:val="center"/>
           </w:tcPr>
           <w:p>
-            <w:r>
-              <w:rPr>
-                <w:color w:val="404040"/>
+            <w:pPr>
+              <w:rPr>
+                <w:color w:val="404040" w:themeColor="text1" w:themeTint="BF" w:themeShade="FF"/>
                 <w:sz w:val="18"/>
                 <w:szCs w:val="18"/>
               </w:rPr>
-              <w:t>Potential Elevated Consequence — Impacts to more than 14 personnel. PEC = C=5. Mark PEC column YES.</w:t>
+            </w:pPr>
+            <w:r>
+              <w:rPr>
+                <w:color w:val="404040" w:themeColor="text1" w:themeTint="BF" w:themeShade="FF"/>
+                <w:sz w:val="18"/>
+                <w:szCs w:val="18"/>
+              </w:rPr>
+              <w:t xml:space="preserve">Potential Elevated Consequence — Impacts </w:t>
+            </w:r>
+            <w:r>
+              <w:rPr>
+                <w:color w:val="404040" w:themeColor="text1" w:themeTint="BF" w:themeShade="FF"/>
+                <w:sz w:val="18"/>
+                <w:szCs w:val="18"/>
+              </w:rPr>
+              <w:t>to</w:t>
+            </w:r>
+            <w:r>
+              <w:rPr>
+                <w:color w:val="404040" w:themeColor="text1" w:themeTint="BF" w:themeShade="FF"/>
+                <w:sz w:val="18"/>
+                <w:szCs w:val="18"/>
+              </w:rPr>
+              <w:t xml:space="preserve"> more than 14 personnel. PEC = C=5. Mark PEC column YES.</w:t>
             </w:r>
           </w:p>
         </w:tc>
@@ -6007,8 +6227,8 @@
         <w:tblLook w:val="04A0" w:firstRow="1" w:lastRow="0" w:firstColumn="1" w:lastColumn="0" w:noHBand="0" w:noVBand="1"/>
       </w:tblPr>
       <w:tblGrid>
-        <w:gridCol w:w="753"/>
-        <w:gridCol w:w="8607"/>
+        <w:gridCol w:w="888"/>
+        <w:gridCol w:w="8472"/>
       </w:tblGrid>
       <w:tr>
         <w:tblPrEx>
@@ -6019,7 +6239,7 @@
         </w:tblPrEx>
         <w:tc>
           <w:tcPr>
-            <w:tcW w:w="640" w:type="dxa"/>
+            <w:tcW w:w="888" w:type="dxa"/>
             <w:tcBorders>
               <w:top w:val="single" w:color="BBBBBB" w:sz="6" w:space="0"/>
               <w:left w:val="single" w:color="BBBBBB" w:sz="6" w:space="0"/>
@@ -6038,19 +6258,39 @@
           <w:p>
             <w:r>
               <w:rPr>
-                <w:b/>
-                <w:bCs/>
-                <w:color w:val="FFFFFF"/>
+                <w:b w:val="1"/>
+                <w:bCs w:val="1"/>
+                <w:color w:val="FFFFFF" w:themeColor="background1" w:themeTint="FF" w:themeShade="FF"/>
                 <w:sz w:val="17"/>
                 <w:szCs w:val="17"/>
               </w:rPr>
-              <w:t>NOTE</w:t>
-            </w:r>
-          </w:p>
-        </w:tc>
-        <w:tc>
-          <w:tcPr>
-            <w:tcW w:w="8720" w:type="dxa"/>
+              <w:t>NO</w:t>
+            </w:r>
+            <w:r>
+              <w:rPr>
+                <w:b w:val="1"/>
+                <w:bCs w:val="1"/>
+                <w:color w:val="FFFFFF" w:themeColor="background1" w:themeTint="FF" w:themeShade="FF"/>
+                <w:sz w:val="17"/>
+                <w:szCs w:val="17"/>
+              </w:rPr>
+              <w:t>T</w:t>
+            </w:r>
+            <w:r>
+              <w:rPr>
+                <w:b w:val="1"/>
+                <w:bCs w:val="1"/>
+                <w:color w:val="FFFFFF" w:themeColor="background1" w:themeTint="FF" w:themeShade="FF"/>
+                <w:sz w:val="17"/>
+                <w:szCs w:val="17"/>
+              </w:rPr>
+              <w:t>E</w:t>
+            </w:r>
+          </w:p>
+        </w:tc>
+        <w:tc>
+          <w:tcPr>
+            <w:tcW w:w="8472" w:type="dxa"/>
             <w:tcBorders>
               <w:top w:val="single" w:color="BBBBBB" w:sz="6" w:space="0"/>
               <w:left w:val="single" w:color="BBBBBB" w:sz="6" w:space="0"/>
@@ -6386,62 +6626,11 @@
             <w:r>
               <w:rPr>
                 <w:rFonts w:ascii="Courier New" w:hAnsi="Courier New" w:eastAsia="Courier New" w:cs="Courier New"/>
-                <w:color w:val="404040"/>
+                <w:color w:val="404040" w:themeColor="text1" w:themeTint="BF" w:themeShade="FF"/>
                 <w:sz w:val="19"/>
                 <w:szCs w:val="19"/>
               </w:rPr>
               <w:t xml:space="preserve">   Note: SDV and BDV are NOT safety devices.</w:t>
-            </w:r>
-          </w:p>
-          <w:p>
-            <w:pPr>
-              <w:spacing w:before="30" w:after="30"/>
-            </w:pPr>
-          </w:p>
-          <w:p>
-            <w:pPr>
-              <w:spacing w:before="30" w:after="30"/>
-            </w:pPr>
-            <w:r>
-              <w:rPr>
-                <w:rFonts w:ascii="Courier New" w:hAnsi="Courier New" w:eastAsia="Courier New" w:cs="Courier New"/>
-                <w:b/>
-                <w:bCs/>
-                <w:color w:val="404040"/>
-                <w:sz w:val="19"/>
-                <w:szCs w:val="19"/>
-              </w:rPr>
-              <w:t>Present the 3 lists clearly and ask the user:</w:t>
-            </w:r>
-          </w:p>
-          <w:p>
-            <w:pPr>
-              <w:spacing w:before="30" w:after="30"/>
-              <w:ind w:left="360"/>
-            </w:pPr>
-            <w:r>
-              <w:rPr>
-                <w:rFonts w:ascii="Courier New" w:hAnsi="Courier New" w:eastAsia="Courier New" w:cs="Courier New"/>
-                <w:color w:val="404040"/>
-                <w:sz w:val="19"/>
-                <w:szCs w:val="19"/>
-              </w:rPr>
-              <w:t>"Please review this extraction. Add or remove any equipment/instruments/safety</w:t>
-            </w:r>
-          </w:p>
-          <w:p>
-            <w:pPr>
-              <w:spacing w:before="30" w:after="30"/>
-              <w:ind w:left="360"/>
-            </w:pPr>
-            <w:r>
-              <w:rPr>
-                <w:rFonts w:ascii="Courier New" w:hAnsi="Courier New" w:eastAsia="Courier New" w:cs="Courier New"/>
-                <w:color w:val="404040"/>
-                <w:sz w:val="19"/>
-                <w:szCs w:val="19"/>
-              </w:rPr>
-              <w:t>devices, or type YES to proceed to the HAZOP."</w:t>
             </w:r>
           </w:p>
         </w:tc>
@@ -6607,15 +6796,66 @@
           <w:p>
             <w:pPr>
               <w:spacing w:before="30" w:after="30"/>
-            </w:pPr>
-            <w:r>
-              <w:rPr>
-                <w:rFonts w:ascii="Courier New" w:hAnsi="Courier New" w:eastAsia="Courier New" w:cs="Courier New"/>
-                <w:color w:val="404040"/>
-                <w:sz w:val="19"/>
-                <w:szCs w:val="19"/>
-              </w:rPr>
-              <w:t>- No generic causes — every cause must reference a specific instrument tag.</w:t>
+              <w:rPr>
+                <w:rFonts w:ascii="Courier New" w:hAnsi="Courier New" w:eastAsia="Courier New" w:cs="Courier New"/>
+                <w:color w:val="404040" w:themeColor="text1" w:themeTint="BF" w:themeShade="FF"/>
+                <w:sz w:val="19"/>
+                <w:szCs w:val="19"/>
+              </w:rPr>
+            </w:pPr>
+            <w:r>
+              <w:rPr>
+                <w:rFonts w:ascii="Courier New" w:hAnsi="Courier New" w:eastAsia="Courier New" w:cs="Courier New"/>
+                <w:color w:val="404040" w:themeColor="text1" w:themeTint="BF" w:themeShade="FF"/>
+                <w:sz w:val="19"/>
+                <w:szCs w:val="19"/>
+              </w:rPr>
+              <w:t>- No generic causes — every cause must reference a specific instrumen</w:t>
+            </w:r>
+            <w:r>
+              <w:rPr>
+                <w:rFonts w:ascii="Courier New" w:hAnsi="Courier New" w:eastAsia="Courier New" w:cs="Courier New"/>
+                <w:color w:val="404040" w:themeColor="text1" w:themeTint="BF" w:themeShade="FF"/>
+                <w:sz w:val="19"/>
+                <w:szCs w:val="19"/>
+              </w:rPr>
+              <w:t>t</w:t>
+            </w:r>
+            <w:r>
+              <w:rPr>
+                <w:rFonts w:ascii="Courier New" w:hAnsi="Courier New" w:eastAsia="Courier New" w:cs="Courier New"/>
+                <w:color w:val="404040" w:themeColor="text1" w:themeTint="BF" w:themeShade="FF"/>
+                <w:sz w:val="19"/>
+                <w:szCs w:val="19"/>
+              </w:rPr>
+              <w:t>.</w:t>
+            </w:r>
+            <w:r>
+              <w:rPr>
+                <w:rFonts w:ascii="Courier New" w:hAnsi="Courier New" w:eastAsia="Courier New" w:cs="Courier New"/>
+                <w:color w:val="404040" w:themeColor="text1" w:themeTint="BF" w:themeShade="FF"/>
+                <w:sz w:val="19"/>
+                <w:szCs w:val="19"/>
+              </w:rPr>
+              <w:t xml:space="preserve"> For Example: FSV – </w:t>
+            </w:r>
+            <w:r>
+              <w:rPr>
+                <w:rFonts w:ascii="Courier New" w:hAnsi="Courier New" w:eastAsia="Courier New" w:cs="Courier New"/>
+                <w:color w:val="404040" w:themeColor="text1" w:themeTint="BF" w:themeShade="FF"/>
+                <w:sz w:val="19"/>
+                <w:szCs w:val="19"/>
+              </w:rPr>
+              <w:t>xxxx</w:t>
+            </w:r>
+            <w:r>
+              <w:rPr>
+                <w:rFonts w:ascii="Courier New" w:hAnsi="Courier New" w:eastAsia="Courier New" w:cs="Courier New"/>
+                <w:color w:val="404040" w:themeColor="text1" w:themeTint="BF" w:themeShade="FF"/>
+                <w:sz w:val="19"/>
+                <w:szCs w:val="19"/>
+              </w:rPr>
+              <w:t xml:space="preserve"> fails closed. </w:t>
             </w:r>
           </w:p>
           <w:p>
@@ -6721,78 +6961,42 @@
             <w:r>
               <w:rPr>
                 <w:rFonts w:ascii="Courier New" w:hAnsi="Courier New" w:eastAsia="Courier New" w:cs="Courier New"/>
-                <w:color w:val="404040"/>
-                <w:sz w:val="19"/>
-                <w:szCs w:val="19"/>
-              </w:rPr>
-              <w:t>Example: FSV-1010 (Gas outlet) fails closed.</w:t>
-            </w:r>
-          </w:p>
-          <w:p>
-            <w:pPr>
-              <w:spacing w:before="30" w:after="30"/>
-            </w:pPr>
-          </w:p>
-          <w:p>
-            <w:pPr>
-              <w:spacing w:before="30" w:after="30"/>
-            </w:pPr>
-            <w:r>
-              <w:rPr>
-                <w:rFonts w:ascii="Courier New" w:hAnsi="Courier New" w:eastAsia="Courier New" w:cs="Courier New"/>
-                <w:b/>
-                <w:bCs/>
-                <w:color w:val="404040"/>
-                <w:sz w:val="19"/>
-                <w:szCs w:val="19"/>
-              </w:rPr>
-              <w:t>List the causes, then ask the user:</w:t>
+                <w:color w:val="404040" w:themeColor="text1" w:themeTint="BF" w:themeShade="FF"/>
+                <w:sz w:val="19"/>
+                <w:szCs w:val="19"/>
+              </w:rPr>
+              <w:t xml:space="preserve">Example: FSV-1010 (Gas outlet) fails </w:t>
+            </w:r>
+            <w:r>
+              <w:rPr>
+                <w:rFonts w:ascii="Courier New" w:hAnsi="Courier New" w:eastAsia="Courier New" w:cs="Courier New"/>
+                <w:color w:val="404040" w:themeColor="text1" w:themeTint="BF" w:themeShade="FF"/>
+                <w:sz w:val="19"/>
+                <w:szCs w:val="19"/>
+              </w:rPr>
+              <w:t>closed</w:t>
+            </w:r>
+            <w:r>
+              <w:rPr>
+                <w:rFonts w:ascii="Courier New" w:hAnsi="Courier New" w:eastAsia="Courier New" w:cs="Courier New"/>
+                <w:color w:val="404040" w:themeColor="text1" w:themeTint="BF" w:themeShade="FF"/>
+                <w:sz w:val="19"/>
+                <w:szCs w:val="19"/>
+              </w:rPr>
+              <w:t>.</w:t>
             </w:r>
           </w:p>
           <w:p>
             <w:pPr>
               <w:spacing w:before="30" w:after="30"/>
               <w:ind w:left="360"/>
-            </w:pPr>
-            <w:r>
-              <w:rPr>
-                <w:rFonts w:ascii="Courier New" w:hAnsi="Courier New" w:eastAsia="Courier New" w:cs="Courier New"/>
-                <w:color w:val="404040"/>
-                <w:sz w:val="19"/>
-                <w:szCs w:val="19"/>
-              </w:rPr>
-              <w:t>"Before I build the HAZOP table, I need two inputs:</w:t>
-            </w:r>
-          </w:p>
-          <w:p>
-            <w:pPr>
-              <w:spacing w:before="30" w:after="30"/>
-              <w:ind w:left="360"/>
-            </w:pPr>
-            <w:r>
-              <w:rPr>
-                <w:rFonts w:ascii="Courier New" w:hAnsi="Courier New" w:eastAsia="Courier New" w:cs="Courier New"/>
-                <w:color w:val="404040"/>
-                <w:sz w:val="19"/>
-                <w:szCs w:val="19"/>
-              </w:rPr>
-              <w:t>1. What is the maximum pressure (PSIG) this vessel could reach if a cause occurs?</w:t>
-            </w:r>
-          </w:p>
-          <w:p>
-            <w:pPr>
-              <w:spacing w:before="30" w:after="30"/>
-              <w:ind w:left="360"/>
-            </w:pPr>
-            <w:r>
-              <w:rPr>
-                <w:rFonts w:ascii="Courier New" w:hAnsi="Courier New" w:eastAsia="Courier New" w:cs="Courier New"/>
-                <w:color w:val="404040"/>
-                <w:sz w:val="19"/>
-                <w:szCs w:val="19"/>
-              </w:rPr>
-              <w:t>2. What is the daily production rate (BOPD)?"</w:t>
-            </w:r>
+              <w:rPr>
+                <w:rFonts w:ascii="Courier New" w:hAnsi="Courier New" w:eastAsia="Courier New" w:cs="Courier New"/>
+                <w:color w:val="404040" w:themeColor="text1" w:themeTint="BF" w:themeShade="FF"/>
+                <w:sz w:val="19"/>
+                <w:szCs w:val="19"/>
+              </w:rPr>
+            </w:pPr>
           </w:p>
         </w:tc>
       </w:tr>
@@ -6911,12 +7115,727 @@
             <w:r>
               <w:rPr>
                 <w:rFonts w:ascii="Courier New" w:hAnsi="Courier New" w:eastAsia="Courier New" w:cs="Courier New"/>
-                <w:color w:val="404040"/>
+                <w:color w:val="404040" w:themeColor="text1" w:themeTint="BF" w:themeShade="FF"/>
                 <w:sz w:val="19"/>
                 <w:szCs w:val="19"/>
               </w:rPr>
               <w:t>Current Risk C (Consequence) | Current Risk P (Probability) | Risk Level</w:t>
             </w:r>
+          </w:p>
+          <w:p>
+            <w:pPr>
+              <w:rPr>
+                <w:rFonts w:ascii="Aptos" w:hAnsi="Aptos" w:eastAsia="Aptos" w:cs="Aptos"/>
+                <w:b w:val="0"/>
+                <w:bCs w:val="0"/>
+                <w:i w:val="0"/>
+                <w:iCs w:val="0"/>
+                <w:caps w:val="0"/>
+                <w:smallCaps w:val="0"/>
+                <w:noProof w:val="0"/>
+                <w:color w:val="000000" w:themeColor="text1" w:themeTint="FF" w:themeShade="FF"/>
+                <w:sz w:val="22"/>
+                <w:szCs w:val="22"/>
+                <w:lang w:val="en-US"/>
+              </w:rPr>
+            </w:pPr>
+          </w:p>
+          <w:p>
+            <w:pPr>
+              <w:rPr>
+                <w:rFonts w:ascii="Aptos" w:hAnsi="Aptos" w:eastAsia="Aptos" w:cs="Aptos"/>
+                <w:b w:val="0"/>
+                <w:bCs w:val="0"/>
+                <w:i w:val="0"/>
+                <w:iCs w:val="0"/>
+                <w:caps w:val="0"/>
+                <w:smallCaps w:val="0"/>
+                <w:noProof w:val="0"/>
+                <w:color w:val="000000" w:themeColor="text1" w:themeTint="FF" w:themeShade="FF"/>
+                <w:sz w:val="22"/>
+                <w:szCs w:val="22"/>
+                <w:lang w:val="en-US"/>
+              </w:rPr>
+            </w:pPr>
+            <w:r>
+              <w:rPr>
+                <w:rFonts w:ascii="Aptos" w:hAnsi="Aptos" w:eastAsia="Aptos" w:cs="Aptos"/>
+                <w:b w:val="0"/>
+                <w:bCs w:val="0"/>
+                <w:i w:val="0"/>
+                <w:iCs w:val="0"/>
+                <w:caps w:val="0"/>
+                <w:smallCaps w:val="0"/>
+                <w:noProof w:val="0"/>
+                <w:color w:val="000000" w:themeColor="text1" w:themeTint="FF" w:themeShade="FF"/>
+                <w:sz w:val="22"/>
+                <w:szCs w:val="22"/>
+                <w:lang w:val="en-US"/>
+              </w:rPr>
+              <w:t>Scenario comments will be in bullets only for PAF Category</w:t>
+            </w:r>
+          </w:p>
+          <w:tbl>
+            <w:tblPr>
+              <w:tblStyle w:val="TableGrid"/>
+              <w:bidiVisual w:val="0"/>
+              <w:tblW w:w="0" w:type="auto"/>
+              <w:tblBorders>
+                <w:top w:val="single" w:sz="6"/>
+                <w:left w:val="single" w:sz="6"/>
+                <w:bottom w:val="single" w:sz="6"/>
+                <w:right w:val="single" w:sz="6"/>
+              </w:tblBorders>
+              <w:tblLook w:val="04A0" w:firstRow="1" w:lastRow="0" w:firstColumn="1" w:lastColumn="0" w:noHBand="0" w:noVBand="1"/>
+            </w:tblPr>
+            <w:tblGrid>
+              <w:gridCol w:w="851"/>
+              <w:gridCol w:w="3403"/>
+              <w:gridCol w:w="4716"/>
+            </w:tblGrid>
+            <w:tr>
+              <w:trPr>
+                <w:trHeight w:val="300"/>
+              </w:trPr>
+              <w:tc>
+                <w:tcPr>
+                  <w:tcW w:w="851" w:type="dxa"/>
+                  <w:tcMar>
+                    <w:left w:w="105" w:type="dxa"/>
+                    <w:right w:w="105" w:type="dxa"/>
+                  </w:tcMar>
+                  <w:vAlign w:val="top"/>
+                </w:tcPr>
+                <w:p>
+                  <w:pPr>
+                    <w:rPr>
+                      <w:rFonts w:ascii="Aptos" w:hAnsi="Aptos" w:eastAsia="Aptos" w:cs="Aptos"/>
+                      <w:b w:val="0"/>
+                      <w:bCs w:val="0"/>
+                      <w:i w:val="0"/>
+                      <w:iCs w:val="0"/>
+                      <w:sz w:val="22"/>
+                      <w:szCs w:val="22"/>
+                    </w:rPr>
+                  </w:pPr>
+                  <w:r>
+                    <w:rPr>
+                      <w:rFonts w:ascii="Aptos" w:hAnsi="Aptos" w:eastAsia="Aptos" w:cs="Aptos"/>
+                      <w:b w:val="0"/>
+                      <w:bCs w:val="0"/>
+                      <w:i w:val="0"/>
+                      <w:iCs w:val="0"/>
+                      <w:sz w:val="22"/>
+                      <w:szCs w:val="22"/>
+                      <w:lang w:val="en-US"/>
+                    </w:rPr>
+                    <w:t>#</w:t>
+                  </w:r>
+                </w:p>
+              </w:tc>
+              <w:tc>
+                <w:tcPr>
+                  <w:tcW w:w="3403" w:type="dxa"/>
+                  <w:tcMar>
+                    <w:left w:w="105" w:type="dxa"/>
+                    <w:right w:w="105" w:type="dxa"/>
+                  </w:tcMar>
+                  <w:vAlign w:val="top"/>
+                </w:tcPr>
+                <w:p>
+                  <w:pPr>
+                    <w:rPr>
+                      <w:rFonts w:ascii="Aptos" w:hAnsi="Aptos" w:eastAsia="Aptos" w:cs="Aptos"/>
+                      <w:b w:val="0"/>
+                      <w:bCs w:val="0"/>
+                      <w:i w:val="0"/>
+                      <w:iCs w:val="0"/>
+                      <w:sz w:val="22"/>
+                      <w:szCs w:val="22"/>
+                    </w:rPr>
+                  </w:pPr>
+                  <w:r>
+                    <w:rPr>
+                      <w:rFonts w:ascii="Aptos" w:hAnsi="Aptos" w:eastAsia="Aptos" w:cs="Aptos"/>
+                      <w:b w:val="0"/>
+                      <w:bCs w:val="0"/>
+                      <w:i w:val="0"/>
+                      <w:iCs w:val="0"/>
+                      <w:sz w:val="22"/>
+                      <w:szCs w:val="22"/>
+                      <w:lang w:val="en-US"/>
+                    </w:rPr>
+                    <w:t xml:space="preserve">Comment </w:t>
+                  </w:r>
+                </w:p>
+              </w:tc>
+              <w:tc>
+                <w:tcPr>
+                  <w:tcW w:w="4716" w:type="dxa"/>
+                  <w:tcMar>
+                    <w:left w:w="105" w:type="dxa"/>
+                    <w:right w:w="105" w:type="dxa"/>
+                  </w:tcMar>
+                  <w:vAlign w:val="top"/>
+                </w:tcPr>
+                <w:p>
+                  <w:pPr>
+                    <w:rPr>
+                      <w:rFonts w:ascii="Aptos" w:hAnsi="Aptos" w:eastAsia="Aptos" w:cs="Aptos"/>
+                      <w:b w:val="0"/>
+                      <w:bCs w:val="0"/>
+                      <w:i w:val="0"/>
+                      <w:iCs w:val="0"/>
+                      <w:sz w:val="22"/>
+                      <w:szCs w:val="22"/>
+                    </w:rPr>
+                  </w:pPr>
+                  <w:r>
+                    <w:rPr>
+                      <w:rFonts w:ascii="Aptos" w:hAnsi="Aptos" w:eastAsia="Aptos" w:cs="Aptos"/>
+                      <w:b w:val="0"/>
+                      <w:bCs w:val="0"/>
+                      <w:i w:val="0"/>
+                      <w:iCs w:val="0"/>
+                      <w:sz w:val="22"/>
+                      <w:szCs w:val="22"/>
+                      <w:lang w:val="en-US"/>
+                    </w:rPr>
+                    <w:t xml:space="preserve">Details </w:t>
+                  </w:r>
+                </w:p>
+              </w:tc>
+            </w:tr>
+            <w:tr>
+              <w:trPr>
+                <w:trHeight w:val="570"/>
+              </w:trPr>
+              <w:tc>
+                <w:tcPr>
+                  <w:tcW w:w="851" w:type="dxa"/>
+                  <w:tcMar>
+                    <w:left w:w="105" w:type="dxa"/>
+                    <w:right w:w="105" w:type="dxa"/>
+                  </w:tcMar>
+                  <w:vAlign w:val="top"/>
+                </w:tcPr>
+                <w:p>
+                  <w:pPr>
+                    <w:rPr>
+                      <w:rFonts w:ascii="Aptos" w:hAnsi="Aptos" w:eastAsia="Aptos" w:cs="Aptos"/>
+                      <w:b w:val="0"/>
+                      <w:bCs w:val="0"/>
+                      <w:i w:val="0"/>
+                      <w:iCs w:val="0"/>
+                      <w:sz w:val="22"/>
+                      <w:szCs w:val="22"/>
+                    </w:rPr>
+                  </w:pPr>
+                  <w:r>
+                    <w:rPr>
+                      <w:rFonts w:ascii="Aptos" w:hAnsi="Aptos" w:eastAsia="Aptos" w:cs="Aptos"/>
+                      <w:b w:val="0"/>
+                      <w:bCs w:val="0"/>
+                      <w:i w:val="0"/>
+                      <w:iCs w:val="0"/>
+                      <w:sz w:val="22"/>
+                      <w:szCs w:val="22"/>
+                      <w:lang w:val="en-US"/>
+                    </w:rPr>
+                    <w:t>1</w:t>
+                  </w:r>
+                </w:p>
+              </w:tc>
+              <w:tc>
+                <w:tcPr>
+                  <w:tcW w:w="3403" w:type="dxa"/>
+                  <w:tcMar>
+                    <w:left w:w="105" w:type="dxa"/>
+                    <w:right w:w="105" w:type="dxa"/>
+                  </w:tcMar>
+                  <w:vAlign w:val="top"/>
+                </w:tcPr>
+                <w:p>
+                  <w:pPr>
+                    <w:rPr>
+                      <w:rFonts w:ascii="Aptos" w:hAnsi="Aptos" w:eastAsia="Aptos" w:cs="Aptos"/>
+                      <w:b w:val="0"/>
+                      <w:bCs w:val="0"/>
+                      <w:i w:val="0"/>
+                      <w:iCs w:val="0"/>
+                      <w:sz w:val="22"/>
+                      <w:szCs w:val="22"/>
+                    </w:rPr>
+                  </w:pPr>
+                  <w:r>
+                    <w:rPr>
+                      <w:rFonts w:ascii="Aptos" w:hAnsi="Aptos" w:eastAsia="Aptos" w:cs="Aptos"/>
+                      <w:b w:val="0"/>
+                      <w:bCs w:val="0"/>
+                      <w:i w:val="0"/>
+                      <w:iCs w:val="0"/>
+                      <w:sz w:val="22"/>
+                      <w:szCs w:val="22"/>
+                      <w:lang w:val="en-US"/>
+                    </w:rPr>
+                    <w:t>Maximum pressure to reach xxxx psi; design pressure is yyyy psi.</w:t>
+                  </w:r>
+                </w:p>
+              </w:tc>
+              <w:tc>
+                <w:tcPr>
+                  <w:tcW w:w="4716" w:type="dxa"/>
+                  <w:tcMar>
+                    <w:left w:w="105" w:type="dxa"/>
+                    <w:right w:w="105" w:type="dxa"/>
+                  </w:tcMar>
+                  <w:vAlign w:val="top"/>
+                </w:tcPr>
+                <w:p>
+                  <w:pPr>
+                    <w:rPr>
+                      <w:rFonts w:ascii="Aptos" w:hAnsi="Aptos" w:eastAsia="Aptos" w:cs="Aptos"/>
+                      <w:b w:val="0"/>
+                      <w:bCs w:val="0"/>
+                      <w:i w:val="0"/>
+                      <w:iCs w:val="0"/>
+                      <w:sz w:val="22"/>
+                      <w:szCs w:val="22"/>
+                    </w:rPr>
+                  </w:pPr>
+                  <w:r>
+                    <w:rPr>
+                      <w:rFonts w:ascii="Aptos" w:hAnsi="Aptos" w:eastAsia="Aptos" w:cs="Aptos"/>
+                      <w:b w:val="0"/>
+                      <w:bCs w:val="0"/>
+                      <w:i w:val="0"/>
+                      <w:iCs w:val="0"/>
+                      <w:sz w:val="22"/>
+                      <w:szCs w:val="22"/>
+                      <w:lang w:val="en-US"/>
+                    </w:rPr>
+                    <w:t>xxxx psi is user input for test/HP Seperator. For other equipments it is the design pressure of upstream equipment ; yyyy comes from the P&amp;ID</w:t>
+                  </w:r>
+                </w:p>
+              </w:tc>
+            </w:tr>
+            <w:tr>
+              <w:trPr>
+                <w:trHeight w:val="1200"/>
+              </w:trPr>
+              <w:tc>
+                <w:tcPr>
+                  <w:tcW w:w="851" w:type="dxa"/>
+                  <w:tcMar>
+                    <w:left w:w="105" w:type="dxa"/>
+                    <w:right w:w="105" w:type="dxa"/>
+                  </w:tcMar>
+                  <w:vAlign w:val="top"/>
+                </w:tcPr>
+                <w:p>
+                  <w:pPr>
+                    <w:rPr>
+                      <w:rFonts w:ascii="Aptos" w:hAnsi="Aptos" w:eastAsia="Aptos" w:cs="Aptos"/>
+                      <w:b w:val="0"/>
+                      <w:bCs w:val="0"/>
+                      <w:i w:val="0"/>
+                      <w:iCs w:val="0"/>
+                      <w:sz w:val="22"/>
+                      <w:szCs w:val="22"/>
+                    </w:rPr>
+                  </w:pPr>
+                  <w:r>
+                    <w:rPr>
+                      <w:rFonts w:ascii="Aptos" w:hAnsi="Aptos" w:eastAsia="Aptos" w:cs="Aptos"/>
+                      <w:b w:val="0"/>
+                      <w:bCs w:val="0"/>
+                      <w:i w:val="0"/>
+                      <w:iCs w:val="0"/>
+                      <w:sz w:val="22"/>
+                      <w:szCs w:val="22"/>
+                      <w:lang w:val="en-US"/>
+                    </w:rPr>
+                    <w:t>2</w:t>
+                  </w:r>
+                </w:p>
+              </w:tc>
+              <w:tc>
+                <w:tcPr>
+                  <w:tcW w:w="3403" w:type="dxa"/>
+                  <w:tcMar>
+                    <w:left w:w="105" w:type="dxa"/>
+                    <w:right w:w="105" w:type="dxa"/>
+                  </w:tcMar>
+                  <w:vAlign w:val="top"/>
+                </w:tcPr>
+                <w:p>
+                  <w:pPr>
+                    <w:rPr>
+                      <w:rFonts w:ascii="Aptos" w:hAnsi="Aptos" w:eastAsia="Aptos" w:cs="Aptos"/>
+                      <w:b w:val="0"/>
+                      <w:bCs w:val="0"/>
+                      <w:i w:val="0"/>
+                      <w:iCs w:val="0"/>
+                      <w:sz w:val="22"/>
+                      <w:szCs w:val="22"/>
+                    </w:rPr>
+                  </w:pPr>
+                  <w:r>
+                    <w:rPr>
+                      <w:rFonts w:ascii="Aptos" w:hAnsi="Aptos" w:eastAsia="Aptos" w:cs="Aptos"/>
+                      <w:b w:val="0"/>
+                      <w:bCs w:val="0"/>
+                      <w:i w:val="0"/>
+                      <w:iCs w:val="0"/>
+                      <w:sz w:val="22"/>
+                      <w:szCs w:val="22"/>
+                      <w:lang w:val="en-US"/>
+                    </w:rPr>
+                    <w:t>Example: &gt; 2x Design pressure: result in Full bore ruptre upto 6 inches, Potential for permamant deformation and piping rupture</w:t>
+                  </w:r>
+                </w:p>
+              </w:tc>
+              <w:tc>
+                <w:tcPr>
+                  <w:tcW w:w="4716" w:type="dxa"/>
+                  <w:tcMar>
+                    <w:left w:w="105" w:type="dxa"/>
+                    <w:right w:w="105" w:type="dxa"/>
+                  </w:tcMar>
+                  <w:vAlign w:val="top"/>
+                </w:tcPr>
+                <w:p>
+                  <w:pPr>
+                    <w:rPr>
+                      <w:rFonts w:ascii="Aptos" w:hAnsi="Aptos" w:eastAsia="Aptos" w:cs="Aptos"/>
+                      <w:b w:val="0"/>
+                      <w:bCs w:val="0"/>
+                      <w:i w:val="0"/>
+                      <w:iCs w:val="0"/>
+                      <w:sz w:val="22"/>
+                      <w:szCs w:val="22"/>
+                    </w:rPr>
+                  </w:pPr>
+                  <w:r>
+                    <w:rPr>
+                      <w:rFonts w:ascii="Aptos" w:hAnsi="Aptos" w:eastAsia="Aptos" w:cs="Aptos"/>
+                      <w:b w:val="0"/>
+                      <w:bCs w:val="0"/>
+                      <w:i w:val="0"/>
+                      <w:iCs w:val="0"/>
+                      <w:sz w:val="22"/>
+                      <w:szCs w:val="22"/>
+                      <w:lang w:val="en-US"/>
+                    </w:rPr>
+                    <w:t xml:space="preserve">Calculate the ratio of Max pressure and Design pressure. Comment based on what you read/ map in Table -2  </w:t>
+                  </w:r>
+                </w:p>
+              </w:tc>
+            </w:tr>
+            <w:tr>
+              <w:trPr>
+                <w:trHeight w:val="1035"/>
+              </w:trPr>
+              <w:tc>
+                <w:tcPr>
+                  <w:tcW w:w="851" w:type="dxa"/>
+                  <w:tcMar>
+                    <w:left w:w="105" w:type="dxa"/>
+                    <w:right w:w="105" w:type="dxa"/>
+                  </w:tcMar>
+                  <w:vAlign w:val="top"/>
+                </w:tcPr>
+                <w:p>
+                  <w:pPr>
+                    <w:rPr>
+                      <w:rFonts w:ascii="Aptos" w:hAnsi="Aptos" w:eastAsia="Aptos" w:cs="Aptos"/>
+                      <w:b w:val="0"/>
+                      <w:bCs w:val="0"/>
+                      <w:i w:val="0"/>
+                      <w:iCs w:val="0"/>
+                      <w:sz w:val="22"/>
+                      <w:szCs w:val="22"/>
+                    </w:rPr>
+                  </w:pPr>
+                  <w:r>
+                    <w:rPr>
+                      <w:rFonts w:ascii="Aptos" w:hAnsi="Aptos" w:eastAsia="Aptos" w:cs="Aptos"/>
+                      <w:b w:val="0"/>
+                      <w:bCs w:val="0"/>
+                      <w:i w:val="0"/>
+                      <w:iCs w:val="0"/>
+                      <w:sz w:val="22"/>
+                      <w:szCs w:val="22"/>
+                      <w:lang w:val="en-US"/>
+                    </w:rPr>
+                    <w:t>3</w:t>
+                  </w:r>
+                </w:p>
+              </w:tc>
+              <w:tc>
+                <w:tcPr>
+                  <w:tcW w:w="3403" w:type="dxa"/>
+                  <w:tcMar>
+                    <w:left w:w="105" w:type="dxa"/>
+                    <w:right w:w="105" w:type="dxa"/>
+                  </w:tcMar>
+                  <w:vAlign w:val="top"/>
+                </w:tcPr>
+                <w:p>
+                  <w:pPr>
+                    <w:rPr>
+                      <w:rFonts w:ascii="Aptos" w:hAnsi="Aptos" w:eastAsia="Aptos" w:cs="Aptos"/>
+                      <w:b w:val="0"/>
+                      <w:bCs w:val="0"/>
+                      <w:i w:val="0"/>
+                      <w:iCs w:val="0"/>
+                      <w:sz w:val="22"/>
+                      <w:szCs w:val="22"/>
+                    </w:rPr>
+                  </w:pPr>
+                  <w:r>
+                    <w:rPr>
+                      <w:rFonts w:ascii="Aptos" w:hAnsi="Aptos" w:eastAsia="Aptos" w:cs="Aptos"/>
+                      <w:b w:val="0"/>
+                      <w:bCs w:val="0"/>
+                      <w:i w:val="0"/>
+                      <w:iCs w:val="0"/>
+                      <w:sz w:val="22"/>
+                      <w:szCs w:val="22"/>
+                      <w:lang w:val="en-US"/>
+                    </w:rPr>
+                    <w:t>Example(if the max pressure is above 100 psi): Potential Jet fire and Vapor cloud explosion.</w:t>
+                  </w:r>
+                </w:p>
+              </w:tc>
+              <w:tc>
+                <w:tcPr>
+                  <w:tcW w:w="4716" w:type="dxa"/>
+                  <w:tcMar>
+                    <w:left w:w="105" w:type="dxa"/>
+                    <w:right w:w="105" w:type="dxa"/>
+                  </w:tcMar>
+                  <w:vAlign w:val="top"/>
+                </w:tcPr>
+                <w:p>
+                  <w:pPr>
+                    <w:rPr>
+                      <w:rFonts w:ascii="Aptos" w:hAnsi="Aptos" w:eastAsia="Aptos" w:cs="Aptos"/>
+                      <w:b w:val="0"/>
+                      <w:bCs w:val="0"/>
+                      <w:i w:val="0"/>
+                      <w:iCs w:val="0"/>
+                      <w:sz w:val="22"/>
+                      <w:szCs w:val="22"/>
+                    </w:rPr>
+                  </w:pPr>
+                  <w:r>
+                    <w:rPr>
+                      <w:rFonts w:ascii="Aptos" w:hAnsi="Aptos" w:eastAsia="Aptos" w:cs="Aptos"/>
+                      <w:b w:val="0"/>
+                      <w:bCs w:val="0"/>
+                      <w:i w:val="0"/>
+                      <w:iCs w:val="0"/>
+                      <w:sz w:val="22"/>
+                      <w:szCs w:val="22"/>
+                      <w:lang w:val="en-US"/>
+                    </w:rPr>
+                    <w:t xml:space="preserve">Look at the event tree and comment the scenario </w:t>
+                  </w:r>
+                </w:p>
+              </w:tc>
+            </w:tr>
+            <w:tr>
+              <w:trPr>
+                <w:trHeight w:val="1725"/>
+              </w:trPr>
+              <w:tc>
+                <w:tcPr>
+                  <w:tcW w:w="851" w:type="dxa"/>
+                  <w:tcMar>
+                    <w:left w:w="105" w:type="dxa"/>
+                    <w:right w:w="105" w:type="dxa"/>
+                  </w:tcMar>
+                  <w:vAlign w:val="top"/>
+                </w:tcPr>
+                <w:p>
+                  <w:pPr>
+                    <w:rPr>
+                      <w:rFonts w:ascii="Aptos" w:hAnsi="Aptos" w:eastAsia="Aptos" w:cs="Aptos"/>
+                      <w:b w:val="0"/>
+                      <w:bCs w:val="0"/>
+                      <w:i w:val="0"/>
+                      <w:iCs w:val="0"/>
+                      <w:sz w:val="22"/>
+                      <w:szCs w:val="22"/>
+                    </w:rPr>
+                  </w:pPr>
+                  <w:r>
+                    <w:rPr>
+                      <w:rFonts w:ascii="Aptos" w:hAnsi="Aptos" w:eastAsia="Aptos" w:cs="Aptos"/>
+                      <w:b w:val="0"/>
+                      <w:bCs w:val="0"/>
+                      <w:i w:val="0"/>
+                      <w:iCs w:val="0"/>
+                      <w:sz w:val="22"/>
+                      <w:szCs w:val="22"/>
+                      <w:lang w:val="en-US"/>
+                    </w:rPr>
+                    <w:t>4</w:t>
+                  </w:r>
+                </w:p>
+              </w:tc>
+              <w:tc>
+                <w:tcPr>
+                  <w:tcW w:w="3403" w:type="dxa"/>
+                  <w:tcMar>
+                    <w:left w:w="105" w:type="dxa"/>
+                    <w:right w:w="105" w:type="dxa"/>
+                  </w:tcMar>
+                  <w:vAlign w:val="top"/>
+                </w:tcPr>
+                <w:p>
+                  <w:pPr>
+                    <w:rPr>
+                      <w:rFonts w:ascii="Aptos" w:hAnsi="Aptos" w:eastAsia="Aptos" w:cs="Aptos"/>
+                      <w:b w:val="0"/>
+                      <w:bCs w:val="0"/>
+                      <w:i w:val="0"/>
+                      <w:iCs w:val="0"/>
+                      <w:sz w:val="22"/>
+                      <w:szCs w:val="22"/>
+                    </w:rPr>
+                  </w:pPr>
+                  <w:r>
+                    <w:rPr>
+                      <w:rFonts w:ascii="Aptos" w:hAnsi="Aptos" w:eastAsia="Aptos" w:cs="Aptos"/>
+                      <w:b w:val="0"/>
+                      <w:bCs w:val="0"/>
+                      <w:i w:val="0"/>
+                      <w:iCs w:val="0"/>
+                      <w:sz w:val="22"/>
+                      <w:szCs w:val="22"/>
+                      <w:lang w:val="en-US"/>
+                    </w:rPr>
+                    <w:t>If PEC, comment PEC-1 (Impacts to more</w:t>
+                  </w:r>
+                  <w:r>
+                    <w:br/>
+                  </w:r>
+                  <w:r>
+                    <w:rPr>
+                      <w:rFonts w:ascii="Aptos" w:hAnsi="Aptos" w:eastAsia="Aptos" w:cs="Aptos"/>
+                      <w:b w:val="0"/>
+                      <w:bCs w:val="0"/>
+                      <w:i w:val="0"/>
+                      <w:iCs w:val="0"/>
+                      <w:sz w:val="22"/>
+                      <w:szCs w:val="22"/>
+                      <w:lang w:val="en-US"/>
+                    </w:rPr>
+                    <w:t>than 14 personnel possible</w:t>
+                  </w:r>
+                  <w:r>
+                    <w:br/>
+                  </w:r>
+                  <w:r>
+                    <w:rPr>
+                      <w:rFonts w:ascii="Aptos" w:hAnsi="Aptos" w:eastAsia="Aptos" w:cs="Aptos"/>
+                      <w:b w:val="0"/>
+                      <w:bCs w:val="0"/>
+                      <w:i w:val="0"/>
+                      <w:iCs w:val="0"/>
+                      <w:sz w:val="22"/>
+                      <w:szCs w:val="22"/>
+                      <w:lang w:val="en-US"/>
+                    </w:rPr>
+                    <w:t>based on daytime manning</w:t>
+                  </w:r>
+                  <w:r>
+                    <w:br/>
+                  </w:r>
+                  <w:r>
+                    <w:rPr>
+                      <w:rFonts w:ascii="Aptos" w:hAnsi="Aptos" w:eastAsia="Aptos" w:cs="Aptos"/>
+                      <w:b w:val="0"/>
+                      <w:bCs w:val="0"/>
+                      <w:i w:val="0"/>
+                      <w:iCs w:val="0"/>
+                      <w:sz w:val="22"/>
+                      <w:szCs w:val="22"/>
+                      <w:lang w:val="en-US"/>
+                    </w:rPr>
+                    <w:t>level and impact hazard</w:t>
+                  </w:r>
+                  <w:r>
+                    <w:br/>
+                  </w:r>
+                  <w:r>
+                    <w:rPr>
+                      <w:rFonts w:ascii="Aptos" w:hAnsi="Aptos" w:eastAsia="Aptos" w:cs="Aptos"/>
+                      <w:b w:val="0"/>
+                      <w:bCs w:val="0"/>
+                      <w:i w:val="0"/>
+                      <w:iCs w:val="0"/>
+                      <w:sz w:val="22"/>
+                      <w:szCs w:val="22"/>
+                      <w:lang w:val="en-US"/>
+                    </w:rPr>
+                    <w:t>zone. If not PEC, write the comments from Table-5 PAF category</w:t>
+                  </w:r>
+                </w:p>
+              </w:tc>
+              <w:tc>
+                <w:tcPr>
+                  <w:tcW w:w="4716" w:type="dxa"/>
+                  <w:tcMar>
+                    <w:left w:w="105" w:type="dxa"/>
+                    <w:right w:w="105" w:type="dxa"/>
+                  </w:tcMar>
+                  <w:vAlign w:val="top"/>
+                </w:tcPr>
+                <w:p>
+                  <w:pPr>
+                    <w:rPr>
+                      <w:rFonts w:ascii="Aptos" w:hAnsi="Aptos" w:eastAsia="Aptos" w:cs="Aptos"/>
+                      <w:b w:val="0"/>
+                      <w:bCs w:val="0"/>
+                      <w:i w:val="0"/>
+                      <w:iCs w:val="0"/>
+                      <w:sz w:val="22"/>
+                      <w:szCs w:val="22"/>
+                    </w:rPr>
+                  </w:pPr>
+                  <w:r>
+                    <w:rPr>
+                      <w:rFonts w:ascii="Aptos" w:hAnsi="Aptos" w:eastAsia="Aptos" w:cs="Aptos"/>
+                      <w:b w:val="0"/>
+                      <w:bCs w:val="0"/>
+                      <w:i w:val="0"/>
+                      <w:iCs w:val="0"/>
+                      <w:sz w:val="22"/>
+                      <w:szCs w:val="22"/>
+                      <w:lang w:val="en-US"/>
+                    </w:rPr>
+                    <w:t>For PAF only- Look at Table 4 : Look at the pressure (2000+ is 2000) and the recommended hole size from table 2 and  map the consequence 1-5. It is 5 if it is PEC.</w:t>
+                  </w:r>
+                  <w:r>
+                    <w:br/>
+                  </w:r>
+                </w:p>
+              </w:tc>
+            </w:tr>
+          </w:tbl>
+          <w:p>
+            <w:pPr>
+              <w:spacing w:before="30" w:after="30"/>
+              <w:rPr>
+                <w:rFonts w:ascii="Courier New" w:hAnsi="Courier New" w:eastAsia="Courier New" w:cs="Courier New"/>
+                <w:color w:val="404040" w:themeColor="text1" w:themeTint="BF" w:themeShade="FF"/>
+                <w:sz w:val="19"/>
+                <w:szCs w:val="19"/>
+              </w:rPr>
+            </w:pPr>
           </w:p>
           <w:p>
             <w:pPr>
@@ -7260,8 +8179,8 @@
         <w:tblLook w:val="04A0" w:firstRow="1" w:lastRow="0" w:firstColumn="1" w:lastColumn="0" w:noHBand="0" w:noVBand="1"/>
       </w:tblPr>
       <w:tblGrid>
-        <w:gridCol w:w="753"/>
-        <w:gridCol w:w="8607"/>
+        <w:gridCol w:w="893"/>
+        <w:gridCol w:w="8467"/>
       </w:tblGrid>
       <w:tr>
         <w:tblPrEx>
@@ -7272,7 +8191,7 @@
         </w:tblPrEx>
         <w:tc>
           <w:tcPr>
-            <w:tcW w:w="640" w:type="dxa"/>
+            <w:tcW w:w="893" w:type="dxa"/>
             <w:tcBorders>
               <w:top w:val="single" w:color="BBBBBB" w:sz="6" w:space="0"/>
               <w:left w:val="single" w:color="BBBBBB" w:sz="6" w:space="0"/>
@@ -7303,7 +8222,7 @@
         </w:tc>
         <w:tc>
           <w:tcPr>
-            <w:tcW w:w="8720" w:type="dxa"/>
+            <w:tcW w:w="8467" w:type="dxa"/>
             <w:tcBorders>
               <w:top w:val="single" w:color="BBBBBB" w:sz="6" w:space="0"/>
               <w:left w:val="single" w:color="BBBBBB" w:sz="6" w:space="0"/>
@@ -21962,6 +22881,32 @@
       <w:szCs w:val="20"/>
     </w:rPr>
   </w:style>
+  <w:style xmlns:w="http://schemas.openxmlformats.org/wordprocessingml/2006/main" w:type="table" w:styleId="TableGrid">
+    <w:name xmlns:w="http://schemas.openxmlformats.org/wordprocessingml/2006/main" w:val="Table Grid"/>
+    <w:basedOn xmlns:w="http://schemas.openxmlformats.org/wordprocessingml/2006/main" w:val="TableNormal"/>
+    <w:uiPriority xmlns:w="http://schemas.openxmlformats.org/wordprocessingml/2006/main" w:val="59"/>
+    <w:rsid xmlns:w="http://schemas.openxmlformats.org/wordprocessingml/2006/main" w:val="00FB4123"/>
+    <w:pPr xmlns:w="http://schemas.openxmlformats.org/wordprocessingml/2006/main">
+      <w:spacing w:after="0" w:line="240" w:lineRule="auto"/>
+    </w:pPr>
+    <w:tblPr xmlns:w="http://schemas.openxmlformats.org/wordprocessingml/2006/main">
+      <w:tblInd w:w="0" w:type="dxa"/>
+      <w:tblBorders>
+        <w:top w:val="single" w:color="000000" w:themeColor="text1" w:sz="4" w:space="0"/>
+        <w:left w:val="single" w:color="000000" w:themeColor="text1" w:sz="4" w:space="0"/>
+        <w:bottom w:val="single" w:color="000000" w:themeColor="text1" w:sz="4" w:space="0"/>
+        <w:right w:val="single" w:color="000000" w:themeColor="text1" w:sz="4" w:space="0"/>
+        <w:insideH w:val="single" w:color="000000" w:themeColor="text1" w:sz="4" w:space="0"/>
+        <w:insideV w:val="single" w:color="000000" w:themeColor="text1" w:sz="4" w:space="0"/>
+      </w:tblBorders>
+      <w:tblCellMar>
+        <w:top w:w="0" w:type="dxa"/>
+        <w:left w:w="108" w:type="dxa"/>
+        <w:bottom w:w="0" w:type="dxa"/>
+        <w:right w:w="108" w:type="dxa"/>
+      </w:tblCellMar>
+    </w:tblPr>
+  </w:style>
 </w:styles>
 </file>
 

</xml_diff>